<commit_message>
multiple updates, clarifications, corrections
</commit_message>
<xml_diff>
--- a/CYBER360-Ex-3.3-Intro-Remoting.docx
+++ b/CYBER360-Ex-3.3-Intro-Remoting.docx
@@ -630,21 +630,7 @@
           <w:szCs w:val="22"/>
         </w:rPr>
         <w:br/>
-        <w:t xml:space="preserve">Password: Your </w:t>
-      </w:r>
-      <w:r>
-        <w:rPr>
-          <w:sz w:val="22"/>
-          <w:szCs w:val="22"/>
-        </w:rPr>
-        <w:t xml:space="preserve">11 digit </w:t>
-      </w:r>
-      <w:r>
-        <w:rPr>
-          <w:sz w:val="22"/>
-          <w:szCs w:val="22"/>
-        </w:rPr>
-        <w:t>I-Number</w:t>
+        <w:t>Password: Your I-Number</w:t>
       </w:r>
       <w:r>
         <w:rPr>
@@ -664,10 +650,84 @@
         <w:rPr>
           <w:b/>
           <w:bCs/>
-          <w:sz w:val="22"/>
-          <w:szCs w:val="22"/>
-        </w:rPr>
-        <w:t>NOTE: Most I-Numbers are fewer digits than 11, you will need to add leading zeros to your I-Number until it is 11 digits long, do not include any spaces or other characters in your password.</w:t>
+          <w:i/>
+          <w:iCs/>
+          <w:sz w:val="22"/>
+          <w:szCs w:val="22"/>
+        </w:rPr>
+        <w:t xml:space="preserve">NOTE: </w:t>
+      </w:r>
+      <w:r>
+        <w:rPr>
+          <w:i/>
+          <w:iCs/>
+          <w:sz w:val="22"/>
+          <w:szCs w:val="22"/>
+        </w:rPr>
+        <w:t xml:space="preserve">Most I-Numbers are </w:t>
+      </w:r>
+      <w:r>
+        <w:rPr>
+          <w:i/>
+          <w:iCs/>
+          <w:sz w:val="22"/>
+          <w:szCs w:val="22"/>
+        </w:rPr>
+        <w:t>either nine or eleven digits</w:t>
+      </w:r>
+      <w:r>
+        <w:rPr>
+          <w:i/>
+          <w:iCs/>
+          <w:sz w:val="22"/>
+          <w:szCs w:val="22"/>
+        </w:rPr>
+        <w:t>.</w:t>
+      </w:r>
+      <w:r>
+        <w:rPr>
+          <w:i/>
+          <w:iCs/>
+          <w:sz w:val="22"/>
+          <w:szCs w:val="22"/>
+        </w:rPr>
+        <w:t xml:space="preserve"> </w:t>
+      </w:r>
+      <w:r>
+        <w:rPr>
+          <w:i/>
+          <w:iCs/>
+          <w:sz w:val="22"/>
+          <w:szCs w:val="22"/>
+        </w:rPr>
+        <w:t>H</w:t>
+      </w:r>
+      <w:r>
+        <w:rPr>
+          <w:i/>
+          <w:iCs/>
+          <w:sz w:val="22"/>
+          <w:szCs w:val="22"/>
+        </w:rPr>
+        <w:t>owever, if your I-Number begins with a 0 (zero), skip the leading zeros</w:t>
+      </w:r>
+      <w:r>
+        <w:rPr>
+          <w:i/>
+          <w:iCs/>
+          <w:sz w:val="22"/>
+          <w:szCs w:val="22"/>
+        </w:rPr>
+        <w:t>.</w:t>
+      </w:r>
+      <w:r>
+        <w:rPr>
+          <w:i/>
+          <w:iCs/>
+          <w:sz w:val="22"/>
+          <w:szCs w:val="22"/>
+        </w:rPr>
+        <w:t xml:space="preserve"> Example: if your I-Number is 001122334, just enter 1122334.</w:t>
       </w:r>
     </w:p>
     <w:p>
@@ -897,23 +957,21 @@
           <w:sz w:val="22"/>
           <w:szCs w:val="22"/>
         </w:rPr>
-        <w:t xml:space="preserve">to facilitate remote access from the Internet </w:t>
-      </w:r>
-      <w:proofErr w:type="gramStart"/>
-      <w:r>
-        <w:rPr>
-          <w:sz w:val="22"/>
-          <w:szCs w:val="22"/>
-        </w:rPr>
-        <w:t>by</w:t>
-      </w:r>
-      <w:proofErr w:type="gramEnd"/>
-      <w:r>
-        <w:rPr>
-          <w:sz w:val="22"/>
-          <w:szCs w:val="22"/>
-        </w:rPr>
-        <w:t xml:space="preserve"> students. It </w:t>
+        <w:t xml:space="preserve">to facilitate </w:t>
+      </w:r>
+      <w:r>
+        <w:rPr>
+          <w:sz w:val="22"/>
+          <w:szCs w:val="22"/>
+        </w:rPr>
+        <w:t xml:space="preserve">students’ </w:t>
+      </w:r>
+      <w:r>
+        <w:rPr>
+          <w:sz w:val="22"/>
+          <w:szCs w:val="22"/>
+        </w:rPr>
+        <w:t xml:space="preserve">remote access from the Internet. It </w:t>
       </w:r>
       <w:r>
         <w:rPr>
@@ -1064,7 +1122,56 @@
           <w:sz w:val="22"/>
           <w:szCs w:val="22"/>
         </w:rPr>
-        <w:t xml:space="preserve">Any cmdlet that has a </w:t>
+        <w:t>Some</w:t>
+      </w:r>
+      <w:r>
+        <w:rPr>
+          <w:sz w:val="22"/>
+          <w:szCs w:val="22"/>
+        </w:rPr>
+        <w:t xml:space="preserve"> </w:t>
+      </w:r>
+      <w:r>
+        <w:rPr>
+          <w:sz w:val="22"/>
+          <w:szCs w:val="22"/>
+        </w:rPr>
+        <w:t xml:space="preserve">cmdlets in </w:t>
+      </w:r>
+      <w:r>
+        <w:rPr>
+          <w:sz w:val="22"/>
+          <w:szCs w:val="22"/>
+        </w:rPr>
+        <w:t>Windows PowerShell</w:t>
+      </w:r>
+      <w:r>
+        <w:rPr>
+          <w:sz w:val="22"/>
+          <w:szCs w:val="22"/>
+        </w:rPr>
+        <w:t xml:space="preserve"> (Desktop edition, version 5.1)</w:t>
+      </w:r>
+      <w:r>
+        <w:rPr>
+          <w:sz w:val="22"/>
+          <w:szCs w:val="22"/>
+        </w:rPr>
+        <w:t xml:space="preserve"> </w:t>
+      </w:r>
+      <w:r>
+        <w:rPr>
+          <w:sz w:val="22"/>
+          <w:szCs w:val="22"/>
+        </w:rPr>
+        <w:t xml:space="preserve">have </w:t>
+      </w:r>
+      <w:r>
+        <w:rPr>
+          <w:sz w:val="22"/>
+          <w:szCs w:val="22"/>
+        </w:rPr>
+        <w:t xml:space="preserve">a </w:t>
       </w:r>
       <w:r>
         <w:rPr>
@@ -1073,14 +1180,25 @@
           <w:sz w:val="22"/>
           <w:szCs w:val="22"/>
         </w:rPr>
-        <w:t>-ComputerName</w:t>
-      </w:r>
-      <w:r>
-        <w:rPr>
-          <w:sz w:val="22"/>
-          <w:szCs w:val="22"/>
-        </w:rPr>
-        <w:t xml:space="preserve"> parameter is capable of remoting. In this task you will use </w:t>
+        <w:t>-</w:t>
+      </w:r>
+      <w:proofErr w:type="spellStart"/>
+      <w:r>
+        <w:rPr>
+          <w:b/>
+          <w:bCs/>
+          <w:sz w:val="22"/>
+          <w:szCs w:val="22"/>
+        </w:rPr>
+        <w:t>ComputerName</w:t>
+      </w:r>
+      <w:proofErr w:type="spellEnd"/>
+      <w:r>
+        <w:rPr>
+          <w:sz w:val="22"/>
+          <w:szCs w:val="22"/>
+        </w:rPr>
+        <w:t xml:space="preserve"> parameter </w:t>
       </w:r>
       <w:proofErr w:type="gramStart"/>
       <w:r>
@@ -1088,7 +1206,7 @@
           <w:sz w:val="22"/>
           <w:szCs w:val="22"/>
         </w:rPr>
-        <w:t>cmdlet based</w:t>
+        <w:t>is capable of remoting</w:t>
       </w:r>
       <w:proofErr w:type="gramEnd"/>
       <w:r>
@@ -1096,7 +1214,35 @@
           <w:sz w:val="22"/>
           <w:szCs w:val="22"/>
         </w:rPr>
-        <w:t xml:space="preserve"> remoting to get </w:t>
+        <w:t>. In this task you will use cmdlet</w:t>
+      </w:r>
+      <w:r>
+        <w:rPr>
+          <w:sz w:val="22"/>
+          <w:szCs w:val="22"/>
+        </w:rPr>
+        <w:t>-</w:t>
+      </w:r>
+      <w:r>
+        <w:rPr>
+          <w:sz w:val="22"/>
+          <w:szCs w:val="22"/>
+        </w:rPr>
+        <w:t>based remoting</w:t>
+      </w:r>
+      <w:r>
+        <w:rPr>
+          <w:sz w:val="22"/>
+          <w:szCs w:val="22"/>
+        </w:rPr>
+        <w:t xml:space="preserve"> </w:t>
+      </w:r>
+      <w:r>
+        <w:rPr>
+          <w:sz w:val="22"/>
+          <w:szCs w:val="22"/>
+        </w:rPr>
+        <w:t xml:space="preserve">to get </w:t>
       </w:r>
       <w:r>
         <w:rPr>
@@ -1153,7 +1299,56 @@
           <w:sz w:val="22"/>
           <w:szCs w:val="22"/>
         </w:rPr>
-        <w:t>The ssh server on the bastion host will automatically place you in a pwsh (PowerShell Core) shell.</w:t>
+        <w:t xml:space="preserve">The ssh server on the bastion host will automatically place you in </w:t>
+      </w:r>
+      <w:r>
+        <w:rPr>
+          <w:sz w:val="22"/>
+          <w:szCs w:val="22"/>
+        </w:rPr>
+        <w:t>a CMD.exe (</w:t>
+      </w:r>
+      <w:r>
+        <w:rPr>
+          <w:sz w:val="22"/>
+          <w:szCs w:val="22"/>
+        </w:rPr>
+        <w:t>C</w:t>
+      </w:r>
+      <w:r>
+        <w:rPr>
+          <w:sz w:val="22"/>
+          <w:szCs w:val="22"/>
+        </w:rPr>
+        <w:t xml:space="preserve">ommand </w:t>
+      </w:r>
+      <w:r>
+        <w:rPr>
+          <w:sz w:val="22"/>
+          <w:szCs w:val="22"/>
+        </w:rPr>
+        <w:t>P</w:t>
+      </w:r>
+      <w:r>
+        <w:rPr>
+          <w:sz w:val="22"/>
+          <w:szCs w:val="22"/>
+        </w:rPr>
+        <w:t>rompt) shell</w:t>
+      </w:r>
+      <w:r>
+        <w:rPr>
+          <w:sz w:val="22"/>
+          <w:szCs w:val="22"/>
+        </w:rPr>
+        <w:t>.</w:t>
+      </w:r>
+      <w:r>
+        <w:rPr>
+          <w:sz w:val="22"/>
+          <w:szCs w:val="22"/>
+        </w:rPr>
+        <w:t xml:space="preserve"> Enter:</w:t>
       </w:r>
       <w:r>
         <w:rPr>
@@ -1164,11 +1359,423 @@
       </w:r>
       <w:r>
         <w:rPr>
+          <w:rFonts w:ascii="Consolas" w:hAnsi="Consolas"/>
+          <w:b/>
+          <w:bCs/>
+          <w:sz w:val="22"/>
+          <w:szCs w:val="22"/>
+        </w:rPr>
+        <w:t xml:space="preserve"> hostname</w:t>
+      </w:r>
+      <w:r>
+        <w:rPr>
+          <w:sz w:val="22"/>
+          <w:szCs w:val="22"/>
+        </w:rPr>
+        <w:t xml:space="preserve"> </w:t>
+      </w:r>
+      <w:r>
+        <w:rPr>
           <w:sz w:val="22"/>
           <w:szCs w:val="22"/>
         </w:rPr>
         <w:br/>
-        <w:t>NOTE: If you wish to run a Windows PowerShell instance start a PowerShell process by typing PowerShell, don’t forget you will be 2 shells deep.  When you want to exit you would first need to exit PowerShell then exit pwsh to close your ssh session.</w:t>
+        <w:t>What’s the actual name of the computer you ssh connected to?</w:t>
+      </w:r>
+      <w:r>
+        <w:rPr>
+          <w:sz w:val="22"/>
+          <w:szCs w:val="22"/>
+        </w:rPr>
+        <w:t xml:space="preserve"> </w:t>
+      </w:r>
+      <w:sdt>
+        <w:sdtPr>
+          <w:rPr>
+            <w:rStyle w:val="AnswerChar"/>
+            <w:sz w:val="22"/>
+            <w:szCs w:val="22"/>
+          </w:rPr>
+          <w:id w:val="296574802"/>
+          <w:placeholder>
+            <w:docPart w:val="44DAE46C7447473297CDCAC75C82D19C"/>
+          </w:placeholder>
+          <w:showingPlcHdr/>
+          <w15:color w:val="800000"/>
+          <w15:appearance w15:val="tags"/>
+          <w:text w:multiLine="1"/>
+        </w:sdtPr>
+        <w:sdtEndPr>
+          <w:rPr>
+            <w:rStyle w:val="DefaultParagraphFont"/>
+            <w:color w:val="auto"/>
+          </w:rPr>
+        </w:sdtEndPr>
+        <w:sdtContent>
+          <w:r>
+            <w:rPr>
+              <w:rStyle w:val="PlaceholderText"/>
+              <w:sz w:val="22"/>
+              <w:szCs w:val="22"/>
+            </w:rPr>
+            <w:t>Click or tap here to enter text.</w:t>
+          </w:r>
+        </w:sdtContent>
+      </w:sdt>
+      <w:r>
+        <w:rPr>
+          <w:sz w:val="22"/>
+          <w:szCs w:val="22"/>
+        </w:rPr>
+        <w:br/>
+      </w:r>
+      <w:r>
+        <w:rPr>
+          <w:sz w:val="22"/>
+          <w:szCs w:val="22"/>
+        </w:rPr>
+        <w:br/>
+      </w:r>
+      <w:r>
+        <w:rPr>
+          <w:sz w:val="22"/>
+          <w:szCs w:val="22"/>
+        </w:rPr>
+        <w:t>Now l</w:t>
+      </w:r>
+      <w:r>
+        <w:rPr>
+          <w:sz w:val="22"/>
+          <w:szCs w:val="22"/>
+        </w:rPr>
+        <w:t>aunch a</w:t>
+      </w:r>
+      <w:r>
+        <w:rPr>
+          <w:sz w:val="22"/>
+          <w:szCs w:val="22"/>
+        </w:rPr>
+        <w:t xml:space="preserve"> PowerShell</w:t>
+      </w:r>
+      <w:r>
+        <w:rPr>
+          <w:sz w:val="22"/>
+          <w:szCs w:val="22"/>
+        </w:rPr>
+        <w:t xml:space="preserve"> Core process</w:t>
+      </w:r>
+      <w:r>
+        <w:rPr>
+          <w:sz w:val="22"/>
+          <w:szCs w:val="22"/>
+        </w:rPr>
+        <w:t xml:space="preserve"> by </w:t>
+      </w:r>
+      <w:proofErr w:type="gramStart"/>
+      <w:r>
+        <w:rPr>
+          <w:sz w:val="22"/>
+          <w:szCs w:val="22"/>
+        </w:rPr>
+        <w:t>typing</w:t>
+      </w:r>
+      <w:r>
+        <w:rPr>
+          <w:sz w:val="22"/>
+          <w:szCs w:val="22"/>
+        </w:rPr>
+        <w:t xml:space="preserve">  </w:t>
+      </w:r>
+      <w:proofErr w:type="spellStart"/>
+      <w:r>
+        <w:rPr>
+          <w:rFonts w:ascii="Consolas" w:hAnsi="Consolas"/>
+          <w:b/>
+          <w:bCs/>
+          <w:sz w:val="22"/>
+          <w:szCs w:val="22"/>
+        </w:rPr>
+        <w:t>pwsh</w:t>
+      </w:r>
+      <w:proofErr w:type="spellEnd"/>
+      <w:proofErr w:type="gramEnd"/>
+      <w:r>
+        <w:rPr>
+          <w:sz w:val="22"/>
+          <w:szCs w:val="22"/>
+        </w:rPr>
+        <w:t>.</w:t>
+      </w:r>
+      <w:r>
+        <w:rPr>
+          <w:sz w:val="22"/>
+          <w:szCs w:val="22"/>
+        </w:rPr>
+        <w:t xml:space="preserve"> </w:t>
+      </w:r>
+      <w:r>
+        <w:rPr>
+          <w:i/>
+          <w:iCs/>
+          <w:sz w:val="22"/>
+          <w:szCs w:val="22"/>
+        </w:rPr>
+        <w:t xml:space="preserve">NOTE: </w:t>
+      </w:r>
+      <w:r>
+        <w:rPr>
+          <w:i/>
+          <w:iCs/>
+          <w:sz w:val="22"/>
+          <w:szCs w:val="22"/>
+        </w:rPr>
+        <w:t>don’t forget yo</w:t>
+      </w:r>
+      <w:r>
+        <w:rPr>
+          <w:i/>
+          <w:iCs/>
+          <w:sz w:val="22"/>
+          <w:szCs w:val="22"/>
+        </w:rPr>
+        <w:t>u’</w:t>
+      </w:r>
+      <w:r>
+        <w:rPr>
+          <w:i/>
+          <w:iCs/>
+          <w:sz w:val="22"/>
+          <w:szCs w:val="22"/>
+        </w:rPr>
+        <w:t xml:space="preserve">ll be </w:t>
+      </w:r>
+      <w:r>
+        <w:rPr>
+          <w:i/>
+          <w:iCs/>
+          <w:sz w:val="22"/>
+          <w:szCs w:val="22"/>
+        </w:rPr>
+        <w:t>“two</w:t>
+      </w:r>
+      <w:r>
+        <w:rPr>
+          <w:i/>
+          <w:iCs/>
+          <w:sz w:val="22"/>
+          <w:szCs w:val="22"/>
+        </w:rPr>
+        <w:t xml:space="preserve"> shells deep.</w:t>
+      </w:r>
+      <w:r>
+        <w:rPr>
+          <w:i/>
+          <w:iCs/>
+          <w:sz w:val="22"/>
+          <w:szCs w:val="22"/>
+        </w:rPr>
+        <w:t>”</w:t>
+      </w:r>
+      <w:r>
+        <w:rPr>
+          <w:i/>
+          <w:iCs/>
+          <w:sz w:val="22"/>
+          <w:szCs w:val="22"/>
+        </w:rPr>
+        <w:t xml:space="preserve"> When</w:t>
+      </w:r>
+      <w:r>
+        <w:rPr>
+          <w:i/>
+          <w:iCs/>
+          <w:sz w:val="22"/>
+          <w:szCs w:val="22"/>
+        </w:rPr>
+        <w:t xml:space="preserve"> you want to close your ssh session, </w:t>
+      </w:r>
+      <w:r>
+        <w:rPr>
+          <w:i/>
+          <w:iCs/>
+          <w:sz w:val="22"/>
+          <w:szCs w:val="22"/>
+        </w:rPr>
+        <w:t>you</w:t>
+      </w:r>
+      <w:r>
+        <w:rPr>
+          <w:i/>
+          <w:iCs/>
+          <w:sz w:val="22"/>
+          <w:szCs w:val="22"/>
+        </w:rPr>
+        <w:t>’ll</w:t>
+      </w:r>
+      <w:r>
+        <w:rPr>
+          <w:i/>
+          <w:iCs/>
+          <w:sz w:val="22"/>
+          <w:szCs w:val="22"/>
+        </w:rPr>
+        <w:t xml:space="preserve"> need </w:t>
+      </w:r>
+      <w:proofErr w:type="gramStart"/>
+      <w:r>
+        <w:rPr>
+          <w:i/>
+          <w:iCs/>
+          <w:sz w:val="22"/>
+          <w:szCs w:val="22"/>
+        </w:rPr>
+        <w:t>to</w:t>
+      </w:r>
+      <w:r>
+        <w:rPr>
+          <w:i/>
+          <w:iCs/>
+          <w:sz w:val="22"/>
+          <w:szCs w:val="22"/>
+        </w:rPr>
+        <w:t xml:space="preserve"> </w:t>
+      </w:r>
+      <w:r>
+        <w:rPr>
+          <w:sz w:val="22"/>
+          <w:szCs w:val="22"/>
+        </w:rPr>
+        <w:t xml:space="preserve"> </w:t>
+      </w:r>
+      <w:r>
+        <w:rPr>
+          <w:rFonts w:ascii="Consolas" w:hAnsi="Consolas"/>
+          <w:b/>
+          <w:bCs/>
+          <w:sz w:val="22"/>
+          <w:szCs w:val="22"/>
+        </w:rPr>
+        <w:t>exit</w:t>
+      </w:r>
+      <w:proofErr w:type="gramEnd"/>
+      <w:r>
+        <w:rPr>
+          <w:sz w:val="22"/>
+          <w:szCs w:val="22"/>
+        </w:rPr>
+        <w:t xml:space="preserve"> </w:t>
+      </w:r>
+      <w:r>
+        <w:rPr>
+          <w:sz w:val="22"/>
+          <w:szCs w:val="22"/>
+        </w:rPr>
+        <w:t xml:space="preserve"> </w:t>
+      </w:r>
+      <w:r>
+        <w:rPr>
+          <w:i/>
+          <w:iCs/>
+          <w:sz w:val="22"/>
+          <w:szCs w:val="22"/>
+        </w:rPr>
+        <w:t>PowerShell</w:t>
+      </w:r>
+      <w:r>
+        <w:rPr>
+          <w:i/>
+          <w:iCs/>
+          <w:sz w:val="22"/>
+          <w:szCs w:val="22"/>
+        </w:rPr>
+        <w:t xml:space="preserve"> Core</w:t>
+      </w:r>
+      <w:r>
+        <w:rPr>
+          <w:i/>
+          <w:iCs/>
+          <w:sz w:val="22"/>
+          <w:szCs w:val="22"/>
+        </w:rPr>
+        <w:t>,</w:t>
+      </w:r>
+      <w:r>
+        <w:rPr>
+          <w:i/>
+          <w:iCs/>
+          <w:sz w:val="22"/>
+          <w:szCs w:val="22"/>
+        </w:rPr>
+        <w:t xml:space="preserve"> </w:t>
+      </w:r>
+      <w:proofErr w:type="gramStart"/>
+      <w:r>
+        <w:rPr>
+          <w:i/>
+          <w:iCs/>
+          <w:sz w:val="22"/>
+          <w:szCs w:val="22"/>
+        </w:rPr>
+        <w:t>then</w:t>
+      </w:r>
+      <w:r>
+        <w:rPr>
+          <w:i/>
+          <w:iCs/>
+          <w:sz w:val="22"/>
+          <w:szCs w:val="22"/>
+        </w:rPr>
+        <w:t xml:space="preserve"> </w:t>
+      </w:r>
+      <w:r>
+        <w:rPr>
+          <w:sz w:val="22"/>
+          <w:szCs w:val="22"/>
+        </w:rPr>
+        <w:t xml:space="preserve"> </w:t>
+      </w:r>
+      <w:r>
+        <w:rPr>
+          <w:rFonts w:ascii="Consolas" w:hAnsi="Consolas"/>
+          <w:b/>
+          <w:bCs/>
+          <w:sz w:val="22"/>
+          <w:szCs w:val="22"/>
+        </w:rPr>
+        <w:t>exit</w:t>
+      </w:r>
+      <w:proofErr w:type="gramEnd"/>
+      <w:r>
+        <w:rPr>
+          <w:sz w:val="22"/>
+          <w:szCs w:val="22"/>
+        </w:rPr>
+        <w:t xml:space="preserve"> </w:t>
+      </w:r>
+      <w:r>
+        <w:rPr>
+          <w:sz w:val="22"/>
+          <w:szCs w:val="22"/>
+        </w:rPr>
+        <w:t xml:space="preserve"> </w:t>
+      </w:r>
+      <w:r>
+        <w:rPr>
+          <w:i/>
+          <w:iCs/>
+          <w:sz w:val="22"/>
+          <w:szCs w:val="22"/>
+        </w:rPr>
+        <w:t>CMD</w:t>
+      </w:r>
+      <w:r>
+        <w:rPr>
+          <w:i/>
+          <w:iCs/>
+          <w:sz w:val="22"/>
+          <w:szCs w:val="22"/>
+        </w:rPr>
+        <w:t>.</w:t>
       </w:r>
       <w:r>
         <w:rPr>
@@ -2251,22 +2858,78 @@
           <w:sz w:val="22"/>
           <w:szCs w:val="22"/>
         </w:rPr>
-        <w:t>Now do the same thing but use Windows PowerShell.</w:t>
-      </w:r>
-      <w:r>
-        <w:rPr>
-          <w:sz w:val="22"/>
-          <w:szCs w:val="22"/>
-        </w:rPr>
-        <w:t xml:space="preserve"> </w:t>
-      </w:r>
-      <w:r>
-        <w:rPr>
-          <w:sz w:val="22"/>
-          <w:szCs w:val="22"/>
-        </w:rPr>
-        <w:br/>
-        <w:t>Open a Windows PowerShell process</w:t>
+        <w:t xml:space="preserve">Now do the same </w:t>
+      </w:r>
+      <w:proofErr w:type="gramStart"/>
+      <w:r>
+        <w:rPr>
+          <w:rStyle w:val="AnswerChar"/>
+          <w:color w:val="000000" w:themeColor="text1"/>
+          <w:sz w:val="22"/>
+          <w:szCs w:val="22"/>
+        </w:rPr>
+        <w:t>thing</w:t>
+      </w:r>
+      <w:r>
+        <w:rPr>
+          <w:rStyle w:val="AnswerChar"/>
+          <w:color w:val="000000" w:themeColor="text1"/>
+          <w:sz w:val="22"/>
+          <w:szCs w:val="22"/>
+        </w:rPr>
+        <w:t>,</w:t>
+      </w:r>
+      <w:r>
+        <w:rPr>
+          <w:rStyle w:val="AnswerChar"/>
+          <w:color w:val="000000" w:themeColor="text1"/>
+          <w:sz w:val="22"/>
+          <w:szCs w:val="22"/>
+        </w:rPr>
+        <w:t xml:space="preserve"> but</w:t>
+      </w:r>
+      <w:proofErr w:type="gramEnd"/>
+      <w:r>
+        <w:rPr>
+          <w:rStyle w:val="AnswerChar"/>
+          <w:color w:val="000000" w:themeColor="text1"/>
+          <w:sz w:val="22"/>
+          <w:szCs w:val="22"/>
+        </w:rPr>
+        <w:t xml:space="preserve"> use </w:t>
+      </w:r>
+      <w:r>
+        <w:rPr>
+          <w:rStyle w:val="AnswerChar"/>
+          <w:color w:val="000000" w:themeColor="text1"/>
+          <w:sz w:val="22"/>
+          <w:szCs w:val="22"/>
+          <w:u w:val="single"/>
+        </w:rPr>
+        <w:t>Windows PowerShell</w:t>
+      </w:r>
+      <w:r>
+        <w:rPr>
+          <w:rStyle w:val="AnswerChar"/>
+          <w:color w:val="000000" w:themeColor="text1"/>
+          <w:sz w:val="22"/>
+          <w:szCs w:val="22"/>
+        </w:rPr>
+        <w:t>.</w:t>
+      </w:r>
+      <w:r>
+        <w:rPr>
+          <w:sz w:val="22"/>
+          <w:szCs w:val="22"/>
+        </w:rPr>
+        <w:t xml:space="preserve"> Open a Windows PowerShell process</w:t>
+      </w:r>
+      <w:r>
+        <w:rPr>
+          <w:sz w:val="22"/>
+          <w:szCs w:val="22"/>
+        </w:rPr>
+        <w:t>:</w:t>
       </w:r>
       <w:r>
         <w:rPr>
@@ -2283,7 +2946,17 @@
           <w:sz w:val="22"/>
           <w:szCs w:val="22"/>
         </w:rPr>
-        <w:t>PowerShell</w:t>
+        <w:t xml:space="preserve"> P</w:t>
+      </w:r>
+      <w:r>
+        <w:rPr>
+          <w:rFonts w:ascii="Consolas" w:hAnsi="Consolas"/>
+          <w:b/>
+          <w:bCs/>
+          <w:sz w:val="22"/>
+          <w:szCs w:val="22"/>
+        </w:rPr>
+        <w:t>owerShell</w:t>
       </w:r>
       <w:r>
         <w:rPr>
@@ -2291,7 +2964,23 @@
           <w:szCs w:val="22"/>
         </w:rPr>
         <w:br/>
-        <w:t>You should see something like this:</w:t>
+        <w:t xml:space="preserve">You should see something </w:t>
+      </w:r>
+      <w:proofErr w:type="gramStart"/>
+      <w:r>
+        <w:rPr>
+          <w:sz w:val="22"/>
+          <w:szCs w:val="22"/>
+        </w:rPr>
+        <w:t>similar to</w:t>
+      </w:r>
+      <w:proofErr w:type="gramEnd"/>
+      <w:r>
+        <w:rPr>
+          <w:sz w:val="22"/>
+          <w:szCs w:val="22"/>
+        </w:rPr>
+        <w:t xml:space="preserve"> this:</w:t>
       </w:r>
       <w:r>
         <w:rPr>
@@ -2299,36 +2988,66 @@
           <w:szCs w:val="22"/>
         </w:rPr>
         <w:br/>
+      </w:r>
+      <w:r>
+        <w:rPr>
+          <w:rFonts w:ascii="Courier New" w:hAnsi="Courier New" w:cs="Courier New"/>
+          <w:sz w:val="22"/>
+          <w:szCs w:val="22"/>
+        </w:rPr>
+        <w:t xml:space="preserve">      </w:t>
+      </w:r>
+      <w:r>
+        <w:rPr>
+          <w:rFonts w:ascii="Courier New" w:hAnsi="Courier New" w:cs="Courier New"/>
+          <w:sz w:val="22"/>
+          <w:szCs w:val="22"/>
+        </w:rPr>
         <w:t>Windows PowerShell</w:t>
       </w:r>
       <w:r>
         <w:rPr>
+          <w:rFonts w:ascii="Courier New" w:hAnsi="Courier New" w:cs="Courier New"/>
           <w:sz w:val="22"/>
           <w:szCs w:val="22"/>
         </w:rPr>
         <w:br/>
+      </w:r>
+      <w:r>
+        <w:rPr>
+          <w:rFonts w:ascii="Courier New" w:hAnsi="Courier New" w:cs="Courier New"/>
+          <w:sz w:val="22"/>
+          <w:szCs w:val="22"/>
+        </w:rPr>
+        <w:t xml:space="preserve">      </w:t>
+      </w:r>
+      <w:r>
+        <w:rPr>
+          <w:rFonts w:ascii="Courier New" w:hAnsi="Courier New" w:cs="Courier New"/>
+          <w:sz w:val="22"/>
+          <w:szCs w:val="22"/>
+        </w:rPr>
         <w:t>Copyright (C) Microsoft Corporation. All rights reserved.</w:t>
       </w:r>
       <w:r>
         <w:rPr>
+          <w:rFonts w:ascii="Courier New" w:hAnsi="Courier New" w:cs="Courier New"/>
           <w:sz w:val="22"/>
           <w:szCs w:val="22"/>
         </w:rPr>
         <w:br/>
-        <w:t xml:space="preserve">Try the new cross-platform PowerShell </w:t>
-      </w:r>
-      <w:hyperlink r:id="rId9" w:history="1">
-        <w:r>
-          <w:rPr>
-            <w:rStyle w:val="Hyperlink"/>
-            <w:sz w:val="22"/>
-            <w:szCs w:val="22"/>
-          </w:rPr>
-          <w:t>https://aka.ms/pscore6</w:t>
-        </w:r>
-      </w:hyperlink>
-      <w:r>
-        <w:rPr>
+      </w:r>
+      <w:r>
+        <w:rPr>
+          <w:rFonts w:ascii="Courier New" w:hAnsi="Courier New" w:cs="Courier New"/>
+          <w:sz w:val="22"/>
+          <w:szCs w:val="22"/>
+        </w:rPr>
+        <w:t xml:space="preserve">      </w:t>
+      </w:r>
+      <w:r>
+        <w:rPr>
+          <w:rFonts w:ascii="Courier New" w:hAnsi="Courier New" w:cs="Courier New"/>
           <w:sz w:val="22"/>
           <w:szCs w:val="22"/>
         </w:rPr>
@@ -2336,6 +3055,15 @@
       </w:r>
       <w:r>
         <w:rPr>
+          <w:rFonts w:ascii="Courier New" w:hAnsi="Courier New" w:cs="Courier New"/>
+          <w:sz w:val="22"/>
+          <w:szCs w:val="22"/>
+        </w:rPr>
+        <w:t xml:space="preserve">      </w:t>
+      </w:r>
+      <w:r>
+        <w:rPr>
+          <w:rFonts w:ascii="Courier New" w:hAnsi="Courier New" w:cs="Courier New"/>
           <w:sz w:val="22"/>
           <w:szCs w:val="22"/>
         </w:rPr>
@@ -3020,7 +3748,37 @@
           <w:sz w:val="22"/>
           <w:szCs w:val="22"/>
         </w:rPr>
-        <w:t xml:space="preserve">he Get-Process cmdlet </w:t>
+        <w:t>he</w:t>
+      </w:r>
+      <w:r>
+        <w:rPr>
+          <w:sz w:val="22"/>
+          <w:szCs w:val="22"/>
+        </w:rPr>
+        <w:t xml:space="preserve"> Windows PowerShell</w:t>
+      </w:r>
+      <w:r>
+        <w:rPr>
+          <w:sz w:val="22"/>
+          <w:szCs w:val="22"/>
+        </w:rPr>
+        <w:t xml:space="preserve"> </w:t>
+      </w:r>
+      <w:r>
+        <w:rPr>
+          <w:b/>
+          <w:bCs/>
+          <w:sz w:val="22"/>
+          <w:szCs w:val="22"/>
+        </w:rPr>
+        <w:t>Get-Process</w:t>
+      </w:r>
+      <w:r>
+        <w:rPr>
+          <w:sz w:val="22"/>
+          <w:szCs w:val="22"/>
+        </w:rPr>
+        <w:t xml:space="preserve"> cmdlet </w:t>
       </w:r>
       <w:r>
         <w:rPr>
@@ -3339,7 +4097,31 @@
           <w:sz w:val="22"/>
           <w:szCs w:val="22"/>
         </w:rPr>
-        <w:t>coputername</w:t>
+        <w:t>co</w:t>
+      </w:r>
+      <w:r>
+        <w:rPr>
+          <w:rStyle w:val="AnswerChar"/>
+          <w:rFonts w:ascii="Consolas" w:hAnsi="Consolas"/>
+          <w:b/>
+          <w:bCs/>
+          <w:color w:val="auto"/>
+          <w:sz w:val="22"/>
+          <w:szCs w:val="22"/>
+        </w:rPr>
+        <w:t>m</w:t>
+      </w:r>
+      <w:r>
+        <w:rPr>
+          <w:rStyle w:val="AnswerChar"/>
+          <w:rFonts w:ascii="Consolas" w:hAnsi="Consolas"/>
+          <w:b/>
+          <w:bCs/>
+          <w:color w:val="auto"/>
+          <w:sz w:val="22"/>
+          <w:szCs w:val="22"/>
+        </w:rPr>
+        <w:t>putername</w:t>
       </w:r>
       <w:proofErr w:type="spellEnd"/>
       <w:r>
@@ -3424,17 +4206,8 @@
           <w:sz w:val="22"/>
           <w:szCs w:val="22"/>
         </w:rPr>
-        <w:t xml:space="preserve"> named </w:t>
-      </w:r>
-      <w:proofErr w:type="spellStart"/>
-      <w:r>
-        <w:rPr>
-          <w:sz w:val="22"/>
-          <w:szCs w:val="22"/>
-        </w:rPr>
-        <w:t>duncan</w:t>
-      </w:r>
-      <w:proofErr w:type="spellEnd"/>
+        <w:t xml:space="preserve"> named duncan</w:t>
+      </w:r>
       <w:r>
         <w:rPr>
           <w:sz w:val="22"/>
@@ -3531,7 +4304,63 @@
           <w:sz w:val="22"/>
           <w:szCs w:val="22"/>
         </w:rPr>
-        <w:t>Windows PowerShell process (this should return you to your PowerShell Core terminal.</w:t>
+        <w:t>PowerShell process</w:t>
+      </w:r>
+      <w:r>
+        <w:rPr>
+          <w:color w:val="000000" w:themeColor="text1"/>
+          <w:sz w:val="22"/>
+          <w:szCs w:val="22"/>
+        </w:rPr>
+        <w:t>es</w:t>
+      </w:r>
+      <w:r>
+        <w:rPr>
+          <w:color w:val="000000" w:themeColor="text1"/>
+          <w:sz w:val="22"/>
+          <w:szCs w:val="22"/>
+        </w:rPr>
+        <w:t xml:space="preserve"> </w:t>
+      </w:r>
+      <w:r>
+        <w:rPr>
+          <w:color w:val="000000" w:themeColor="text1"/>
+          <w:sz w:val="22"/>
+          <w:szCs w:val="22"/>
+        </w:rPr>
+        <w:t xml:space="preserve">to </w:t>
+      </w:r>
+      <w:r>
+        <w:rPr>
+          <w:color w:val="000000" w:themeColor="text1"/>
+          <w:sz w:val="22"/>
+          <w:szCs w:val="22"/>
+        </w:rPr>
+        <w:t xml:space="preserve">return you to your </w:t>
+      </w:r>
+      <w:r>
+        <w:rPr>
+          <w:color w:val="000000" w:themeColor="text1"/>
+          <w:sz w:val="22"/>
+          <w:szCs w:val="22"/>
+        </w:rPr>
+        <w:t xml:space="preserve">CMD.exe </w:t>
+      </w:r>
+      <w:r>
+        <w:rPr>
+          <w:color w:val="000000" w:themeColor="text1"/>
+          <w:sz w:val="22"/>
+          <w:szCs w:val="22"/>
+        </w:rPr>
+        <w:t xml:space="preserve">remote </w:t>
+      </w:r>
+      <w:r>
+        <w:rPr>
+          <w:color w:val="000000" w:themeColor="text1"/>
+          <w:sz w:val="22"/>
+          <w:szCs w:val="22"/>
+        </w:rPr>
+        <w:t>terminal.</w:t>
       </w:r>
       <w:r>
         <w:rPr>
@@ -3562,91 +4391,51 @@
           <w:sz w:val="22"/>
           <w:szCs w:val="22"/>
         </w:rPr>
-        <w:t>When using cmdlet-based remoting, the cmdlet use</w:t>
-      </w:r>
-      <w:r>
-        <w:rPr>
-          <w:sz w:val="22"/>
-          <w:szCs w:val="22"/>
-        </w:rPr>
-        <w:t>s</w:t>
-      </w:r>
-      <w:r>
-        <w:rPr>
-          <w:sz w:val="22"/>
-          <w:szCs w:val="22"/>
-        </w:rPr>
-        <w:t xml:space="preserve"> whatever mechanism</w:t>
-      </w:r>
-      <w:r>
-        <w:rPr>
-          <w:sz w:val="22"/>
-          <w:szCs w:val="22"/>
-        </w:rPr>
-        <w:t xml:space="preserve"> the cmdlet’s developer implemented</w:t>
-      </w:r>
-      <w:r>
-        <w:rPr>
-          <w:sz w:val="22"/>
-          <w:szCs w:val="22"/>
-        </w:rPr>
-        <w:t xml:space="preserve"> to perform the remoting. Some of the advantages to cmdlet-based remoting include flexibility and speed. A drawback is that you need to configure </w:t>
-      </w:r>
-      <w:r>
-        <w:rPr>
-          <w:sz w:val="22"/>
-          <w:szCs w:val="22"/>
-        </w:rPr>
-        <w:t>whatever</w:t>
-      </w:r>
-      <w:r>
-        <w:rPr>
-          <w:sz w:val="22"/>
-          <w:szCs w:val="22"/>
-        </w:rPr>
-        <w:t xml:space="preserve"> underlying remoting </w:t>
-      </w:r>
-      <w:r>
-        <w:rPr>
-          <w:sz w:val="22"/>
-          <w:szCs w:val="22"/>
-        </w:rPr>
-        <w:t>technique that each cmdlet</w:t>
-      </w:r>
-      <w:r>
-        <w:rPr>
-          <w:sz w:val="22"/>
-          <w:szCs w:val="22"/>
-        </w:rPr>
-        <w:t xml:space="preserve"> use</w:t>
-      </w:r>
-      <w:r>
-        <w:rPr>
-          <w:sz w:val="22"/>
-          <w:szCs w:val="22"/>
-        </w:rPr>
-        <w:t>s</w:t>
-      </w:r>
-      <w:r>
-        <w:rPr>
-          <w:sz w:val="22"/>
-          <w:szCs w:val="22"/>
-        </w:rPr>
-        <w:t xml:space="preserve">. </w:t>
-      </w:r>
-      <w:r>
-        <w:rPr>
-          <w:sz w:val="22"/>
-          <w:szCs w:val="22"/>
-        </w:rPr>
-        <w:t>Such configuration</w:t>
-      </w:r>
-      <w:r>
-        <w:rPr>
-          <w:sz w:val="22"/>
-          <w:szCs w:val="22"/>
-        </w:rPr>
-        <w:t xml:space="preserve"> may include firewall rules, permissions</w:t>
+        <w:t xml:space="preserve">When using cmdlet-based remoting, </w:t>
+      </w:r>
+      <w:r>
+        <w:rPr>
+          <w:sz w:val="22"/>
+          <w:szCs w:val="22"/>
+        </w:rPr>
+        <w:t>each</w:t>
+      </w:r>
+      <w:r>
+        <w:rPr>
+          <w:sz w:val="22"/>
+          <w:szCs w:val="22"/>
+        </w:rPr>
+        <w:t xml:space="preserve"> cmdlet </w:t>
+      </w:r>
+      <w:r>
+        <w:rPr>
+          <w:sz w:val="22"/>
+          <w:szCs w:val="22"/>
+        </w:rPr>
+        <w:t xml:space="preserve">relies on the remoting mechanism implemented by its developer. This can make its </w:t>
+      </w:r>
+      <w:proofErr w:type="gramStart"/>
+      <w:r>
+        <w:rPr>
+          <w:sz w:val="22"/>
+          <w:szCs w:val="22"/>
+        </w:rPr>
+        <w:t>remoting flexible</w:t>
+      </w:r>
+      <w:proofErr w:type="gramEnd"/>
+      <w:r>
+        <w:rPr>
+          <w:sz w:val="22"/>
+          <w:szCs w:val="22"/>
+        </w:rPr>
+        <w:t xml:space="preserve"> and fast, but it becomes dependent on the underlying technology’s configuration, such as permissions and firewall rules. </w:t>
+      </w:r>
+      <w:r>
+        <w:rPr>
+          <w:sz w:val="22"/>
+          <w:szCs w:val="22"/>
+        </w:rPr>
+        <w:t>Also</w:t>
       </w:r>
       <w:r>
         <w:rPr>
@@ -3660,35 +4449,7 @@
           <w:sz w:val="22"/>
           <w:szCs w:val="22"/>
         </w:rPr>
-        <w:t xml:space="preserve"> </w:t>
-      </w:r>
-      <w:r>
-        <w:rPr>
-          <w:sz w:val="22"/>
-          <w:szCs w:val="22"/>
-        </w:rPr>
-        <w:t>etc</w:t>
-      </w:r>
-      <w:r>
-        <w:rPr>
-          <w:sz w:val="22"/>
-          <w:szCs w:val="22"/>
-        </w:rPr>
-        <w:t>. Also</w:t>
-      </w:r>
-      <w:r>
-        <w:rPr>
-          <w:sz w:val="22"/>
-          <w:szCs w:val="22"/>
-        </w:rPr>
-        <w:t>,</w:t>
-      </w:r>
-      <w:r>
-        <w:rPr>
-          <w:sz w:val="22"/>
-          <w:szCs w:val="22"/>
-        </w:rPr>
-        <w:t xml:space="preserve"> you can only remote the cmdlets that </w:t>
+        <w:t xml:space="preserve"> you can only remote cmdlets that </w:t>
       </w:r>
       <w:r>
         <w:rPr>
@@ -3702,7 +4463,37 @@
           <w:sz w:val="22"/>
           <w:szCs w:val="22"/>
         </w:rPr>
-        <w:t xml:space="preserve"> specifically designed for remoting.</w:t>
+        <w:t xml:space="preserve"> specifically designed</w:t>
+      </w:r>
+      <w:r>
+        <w:rPr>
+          <w:sz w:val="22"/>
+          <w:szCs w:val="22"/>
+        </w:rPr>
+        <w:t xml:space="preserve"> to support that </w:t>
+      </w:r>
+      <w:proofErr w:type="gramStart"/>
+      <w:r>
+        <w:rPr>
+          <w:sz w:val="22"/>
+          <w:szCs w:val="22"/>
+        </w:rPr>
+        <w:t>particular remoting</w:t>
+      </w:r>
+      <w:proofErr w:type="gramEnd"/>
+      <w:r>
+        <w:rPr>
+          <w:sz w:val="22"/>
+          <w:szCs w:val="22"/>
+        </w:rPr>
+        <w:t xml:space="preserve"> protocol</w:t>
+      </w:r>
+      <w:r>
+        <w:rPr>
+          <w:sz w:val="22"/>
+          <w:szCs w:val="22"/>
+        </w:rPr>
+        <w:t>.</w:t>
       </w:r>
     </w:p>
     <w:p>
@@ -3761,21 +4552,42 @@
           <w:sz w:val="22"/>
           <w:szCs w:val="22"/>
         </w:rPr>
-        <w:t xml:space="preserve"> provides a PowerShell based remoting infrastructure</w:t>
-      </w:r>
-      <w:r>
-        <w:rPr>
-          <w:sz w:val="22"/>
-          <w:szCs w:val="22"/>
-        </w:rPr>
-        <w:t xml:space="preserve">. It </w:t>
-      </w:r>
-      <w:r>
-        <w:rPr>
-          <w:sz w:val="22"/>
-          <w:szCs w:val="22"/>
-        </w:rPr>
-        <w:t xml:space="preserve">allows you to launch a remote PowerShell session and run </w:t>
+        <w:t xml:space="preserve"> provides a PowerShell based</w:t>
+      </w:r>
+      <w:r>
+        <w:rPr>
+          <w:sz w:val="22"/>
+          <w:szCs w:val="22"/>
+        </w:rPr>
+        <w:t xml:space="preserve"> general-purpose</w:t>
+      </w:r>
+      <w:r>
+        <w:rPr>
+          <w:sz w:val="22"/>
+          <w:szCs w:val="22"/>
+        </w:rPr>
+        <w:t xml:space="preserve"> remoting infrastructure</w:t>
+      </w:r>
+      <w:r>
+        <w:rPr>
+          <w:sz w:val="22"/>
+          <w:szCs w:val="22"/>
+        </w:rPr>
+        <w:t>. It</w:t>
+      </w:r>
+      <w:r>
+        <w:rPr>
+          <w:sz w:val="22"/>
+          <w:szCs w:val="22"/>
+        </w:rPr>
+        <w:t xml:space="preserve"> lets you start a r</w:t>
+      </w:r>
+      <w:r>
+        <w:rPr>
+          <w:sz w:val="22"/>
+          <w:szCs w:val="22"/>
+        </w:rPr>
+        <w:t xml:space="preserve">emote PowerShell session and run </w:t>
       </w:r>
       <w:r>
         <w:rPr>
@@ -3791,7 +4603,21 @@
           <w:sz w:val="22"/>
           <w:szCs w:val="22"/>
         </w:rPr>
-        <w:t xml:space="preserve"> script on it you wish. </w:t>
+        <w:t xml:space="preserve"> script on </w:t>
+      </w:r>
+      <w:r>
+        <w:rPr>
+          <w:sz w:val="22"/>
+          <w:szCs w:val="22"/>
+        </w:rPr>
+        <w:t>the target computer</w:t>
+      </w:r>
+      <w:r>
+        <w:rPr>
+          <w:sz w:val="22"/>
+          <w:szCs w:val="22"/>
+        </w:rPr>
+        <w:t xml:space="preserve">. </w:t>
       </w:r>
       <w:r>
         <w:rPr>
@@ -3807,21 +4633,12 @@
         </w:rPr>
         <w:t xml:space="preserve">he script </w:t>
       </w:r>
-      <w:proofErr w:type="gramStart"/>
-      <w:r>
-        <w:rPr>
-          <w:sz w:val="22"/>
-          <w:szCs w:val="22"/>
-        </w:rPr>
-        <w:t>actually runs</w:t>
-      </w:r>
-      <w:proofErr w:type="gramEnd"/>
-      <w:r>
-        <w:rPr>
-          <w:sz w:val="22"/>
-          <w:szCs w:val="22"/>
-        </w:rPr>
-        <w:t xml:space="preserve"> locally on the </w:t>
+      <w:r>
+        <w:rPr>
+          <w:sz w:val="22"/>
+          <w:szCs w:val="22"/>
+        </w:rPr>
+        <w:t xml:space="preserve">executes locally </w:t>
       </w:r>
       <w:r>
         <w:rPr>
@@ -3829,119 +4646,7 @@
           <w:szCs w:val="22"/>
         </w:rPr>
         <w:lastRenderedPageBreak/>
-        <w:t xml:space="preserve">remote </w:t>
-      </w:r>
-      <w:r>
-        <w:rPr>
-          <w:sz w:val="22"/>
-          <w:szCs w:val="22"/>
-        </w:rPr>
-        <w:t>machine</w:t>
-      </w:r>
-      <w:r>
-        <w:rPr>
-          <w:sz w:val="22"/>
-          <w:szCs w:val="22"/>
-        </w:rPr>
-        <w:t>.</w:t>
-      </w:r>
-      <w:r>
-        <w:rPr>
-          <w:sz w:val="22"/>
-          <w:szCs w:val="22"/>
-        </w:rPr>
-        <w:t xml:space="preserve"> </w:t>
-      </w:r>
-      <w:r>
-        <w:rPr>
-          <w:sz w:val="22"/>
-          <w:szCs w:val="22"/>
-        </w:rPr>
-        <w:t>I</w:t>
-      </w:r>
-      <w:r>
-        <w:rPr>
-          <w:sz w:val="22"/>
-          <w:szCs w:val="22"/>
-        </w:rPr>
-        <w:t xml:space="preserve">t just needs a </w:t>
-      </w:r>
-      <w:r>
-        <w:rPr>
-          <w:sz w:val="22"/>
-          <w:szCs w:val="22"/>
-        </w:rPr>
-        <w:t>secure method of remoting</w:t>
-      </w:r>
-      <w:r>
-        <w:rPr>
-          <w:sz w:val="22"/>
-          <w:szCs w:val="22"/>
-        </w:rPr>
-        <w:t>,</w:t>
-      </w:r>
-      <w:r>
-        <w:rPr>
-          <w:sz w:val="22"/>
-          <w:szCs w:val="22"/>
-        </w:rPr>
-        <w:t xml:space="preserve"> </w:t>
-      </w:r>
-      <w:r>
-        <w:rPr>
-          <w:sz w:val="22"/>
-          <w:szCs w:val="22"/>
-        </w:rPr>
-        <w:t>so that it can</w:t>
-      </w:r>
-      <w:r>
-        <w:rPr>
-          <w:sz w:val="22"/>
-          <w:szCs w:val="22"/>
-        </w:rPr>
-        <w:t xml:space="preserve"> deliver the script to the target</w:t>
-      </w:r>
-      <w:r>
-        <w:rPr>
-          <w:sz w:val="22"/>
-          <w:szCs w:val="22"/>
-        </w:rPr>
-        <w:t>.</w:t>
-      </w:r>
-      <w:r>
-        <w:rPr>
-          <w:sz w:val="22"/>
-          <w:szCs w:val="22"/>
-        </w:rPr>
-        <w:t xml:space="preserve"> It does have </w:t>
-      </w:r>
-      <w:r>
-        <w:rPr>
-          <w:sz w:val="22"/>
-          <w:szCs w:val="22"/>
-        </w:rPr>
-        <w:t xml:space="preserve">at least one </w:t>
-      </w:r>
-      <w:r>
-        <w:rPr>
-          <w:sz w:val="22"/>
-          <w:szCs w:val="22"/>
-        </w:rPr>
-        <w:t>drawback</w:t>
-      </w:r>
-      <w:r>
-        <w:rPr>
-          <w:sz w:val="22"/>
-          <w:szCs w:val="22"/>
-        </w:rPr>
-        <w:t>:</w:t>
-      </w:r>
-      <w:r>
-        <w:rPr>
-          <w:sz w:val="22"/>
-          <w:szCs w:val="22"/>
-        </w:rPr>
-        <w:t xml:space="preserve"> </w:t>
+        <w:t xml:space="preserve">on that computer; </w:t>
       </w:r>
       <w:r>
         <w:rPr>
@@ -3957,7 +4662,14 @@
           <w:sz w:val="22"/>
           <w:szCs w:val="22"/>
         </w:rPr>
-        <w:t xml:space="preserve"> must launch a</w:t>
+        <w:t xml:space="preserve"> just delivers it. But it </w:t>
+      </w:r>
+      <w:r>
+        <w:rPr>
+          <w:sz w:val="22"/>
+          <w:szCs w:val="22"/>
+        </w:rPr>
+        <w:t>must launch a</w:t>
       </w:r>
       <w:r>
         <w:rPr>
@@ -4006,42 +4718,28 @@
           <w:sz w:val="22"/>
           <w:szCs w:val="22"/>
         </w:rPr>
-        <w:t xml:space="preserve">which is </w:t>
-      </w:r>
-      <w:r>
-        <w:rPr>
-          <w:sz w:val="22"/>
-          <w:szCs w:val="22"/>
-        </w:rPr>
-        <w:t xml:space="preserve">processing </w:t>
-      </w:r>
-      <w:r>
-        <w:rPr>
-          <w:sz w:val="22"/>
-          <w:szCs w:val="22"/>
-        </w:rPr>
-        <w:t xml:space="preserve">overhead </w:t>
-      </w:r>
-      <w:r>
-        <w:rPr>
-          <w:sz w:val="22"/>
-          <w:szCs w:val="22"/>
-        </w:rPr>
-        <w:t xml:space="preserve">that makes script execution take longer on the remote </w:t>
-      </w:r>
-      <w:r>
-        <w:rPr>
-          <w:sz w:val="22"/>
-          <w:szCs w:val="22"/>
-        </w:rPr>
-        <w:t>host</w:t>
-      </w:r>
-      <w:r>
-        <w:rPr>
-          <w:sz w:val="22"/>
-          <w:szCs w:val="22"/>
-        </w:rPr>
-        <w:t xml:space="preserve"> than it would locally.</w:t>
+        <w:t xml:space="preserve">adding overhead that makes execution slower </w:t>
+      </w:r>
+      <w:r>
+        <w:rPr>
+          <w:sz w:val="22"/>
+          <w:szCs w:val="22"/>
+        </w:rPr>
+        <w:t xml:space="preserve">than </w:t>
+      </w:r>
+      <w:r>
+        <w:rPr>
+          <w:sz w:val="22"/>
+          <w:szCs w:val="22"/>
+        </w:rPr>
+        <w:t>running the script</w:t>
+      </w:r>
+      <w:r>
+        <w:rPr>
+          <w:sz w:val="22"/>
+          <w:szCs w:val="22"/>
+        </w:rPr>
+        <w:t xml:space="preserve"> locally.</w:t>
       </w:r>
     </w:p>
     <w:p>
@@ -4087,6 +4785,69 @@
           <w:szCs w:val="22"/>
         </w:rPr>
         <w:t>remote machine.</w:t>
+      </w:r>
+      <w:r>
+        <w:rPr>
+          <w:sz w:val="22"/>
+          <w:szCs w:val="22"/>
+        </w:rPr>
+        <w:t xml:space="preserve"> Before proceeding with this task, be sure you are still logged in to the 360lab.cse.byui.edu lab with ssh, then start </w:t>
+      </w:r>
+      <w:proofErr w:type="gramStart"/>
+      <w:r>
+        <w:rPr>
+          <w:sz w:val="22"/>
+          <w:szCs w:val="22"/>
+        </w:rPr>
+        <w:t xml:space="preserve">either  </w:t>
+      </w:r>
+      <w:proofErr w:type="spellStart"/>
+      <w:r>
+        <w:rPr>
+          <w:rFonts w:ascii="Consolas" w:hAnsi="Consolas"/>
+          <w:b/>
+          <w:bCs/>
+          <w:sz w:val="22"/>
+          <w:szCs w:val="22"/>
+        </w:rPr>
+        <w:t>pwsh</w:t>
+      </w:r>
+      <w:proofErr w:type="spellEnd"/>
+      <w:proofErr w:type="gramEnd"/>
+      <w:r>
+        <w:rPr>
+          <w:sz w:val="22"/>
+          <w:szCs w:val="22"/>
+        </w:rPr>
+        <w:t xml:space="preserve">  </w:t>
+      </w:r>
+      <w:proofErr w:type="gramStart"/>
+      <w:r>
+        <w:rPr>
+          <w:sz w:val="22"/>
+          <w:szCs w:val="22"/>
+        </w:rPr>
+        <w:t xml:space="preserve">or  </w:t>
+      </w:r>
+      <w:proofErr w:type="spellStart"/>
+      <w:r>
+        <w:rPr>
+          <w:rFonts w:ascii="Consolas" w:hAnsi="Consolas"/>
+          <w:b/>
+          <w:bCs/>
+          <w:sz w:val="22"/>
+          <w:szCs w:val="22"/>
+        </w:rPr>
+        <w:t>powershell</w:t>
+      </w:r>
+      <w:proofErr w:type="spellEnd"/>
+      <w:proofErr w:type="gramEnd"/>
+      <w:r>
+        <w:rPr>
+          <w:sz w:val="22"/>
+          <w:szCs w:val="22"/>
+        </w:rPr>
+        <w:t>.</w:t>
       </w:r>
     </w:p>
     <w:p>
@@ -4699,14 +5460,37 @@
           <w:sz w:val="22"/>
           <w:szCs w:val="22"/>
         </w:rPr>
-        <w:t>DC’s</w:t>
-      </w:r>
-      <w:r>
-        <w:rPr>
-          <w:sz w:val="22"/>
-          <w:szCs w:val="22"/>
-        </w:rPr>
-        <w:t xml:space="preserve"> Processor_Architecture?</w:t>
+        <w:t>SLAGORE</w:t>
+      </w:r>
+      <w:r>
+        <w:rPr>
+          <w:sz w:val="22"/>
+          <w:szCs w:val="22"/>
+        </w:rPr>
+        <w:t>’s</w:t>
+      </w:r>
+      <w:r>
+        <w:rPr>
+          <w:sz w:val="22"/>
+          <w:szCs w:val="22"/>
+        </w:rPr>
+        <w:t xml:space="preserve"> </w:t>
+      </w:r>
+      <w:proofErr w:type="spellStart"/>
+      <w:r>
+        <w:rPr>
+          <w:sz w:val="22"/>
+          <w:szCs w:val="22"/>
+        </w:rPr>
+        <w:t>Processor_Architecture</w:t>
+      </w:r>
+      <w:proofErr w:type="spellEnd"/>
+      <w:r>
+        <w:rPr>
+          <w:sz w:val="22"/>
+          <w:szCs w:val="22"/>
+        </w:rPr>
+        <w:t>?</w:t>
       </w:r>
       <w:r>
         <w:rPr>
@@ -4890,7 +5674,7 @@
           <w:sz w:val="22"/>
           <w:szCs w:val="22"/>
         </w:rPr>
-        <w:t>Duncan</w:t>
+        <w:t>DUNCAN</w:t>
       </w:r>
       <w:r>
         <w:rPr>
@@ -4912,34 +5696,171 @@
           <w:sz w:val="22"/>
           <w:szCs w:val="22"/>
         </w:rPr>
-        <w:t xml:space="preserve">Invoke-Command -ComputerName </w:t>
-      </w:r>
+        <w:t>Invoke-Command -</w:t>
+      </w:r>
+      <w:proofErr w:type="spellStart"/>
       <w:r>
         <w:rPr>
           <w:rStyle w:val="CommandChar"/>
           <w:sz w:val="22"/>
           <w:szCs w:val="22"/>
         </w:rPr>
+        <w:t>ComputerName</w:t>
+      </w:r>
+      <w:proofErr w:type="spellEnd"/>
+      <w:r>
+        <w:rPr>
+          <w:rStyle w:val="CommandChar"/>
+          <w:sz w:val="22"/>
+          <w:szCs w:val="22"/>
+        </w:rPr>
+        <w:t xml:space="preserve"> </w:t>
+      </w:r>
+      <w:proofErr w:type="spellStart"/>
+      <w:r>
+        <w:rPr>
+          <w:rStyle w:val="CommandChar"/>
+          <w:sz w:val="22"/>
+          <w:szCs w:val="22"/>
+        </w:rPr>
         <w:t>duncan</w:t>
       </w:r>
+      <w:proofErr w:type="spellEnd"/>
       <w:r>
         <w:rPr>
           <w:rStyle w:val="CommandChar"/>
           <w:sz w:val="22"/>
           <w:szCs w:val="22"/>
         </w:rPr>
-        <w:t xml:space="preserve"> -ScriptBlock {dir </w:t>
-      </w:r>
-      <w:proofErr w:type="gramStart"/>
+        <w:t xml:space="preserve"> -</w:t>
+      </w:r>
+      <w:proofErr w:type="spellStart"/>
       <w:r>
         <w:rPr>
           <w:rStyle w:val="CommandChar"/>
           <w:sz w:val="22"/>
           <w:szCs w:val="22"/>
         </w:rPr>
-        <w:t>env:}</w:t>
-      </w:r>
-      <w:proofErr w:type="gramEnd"/>
+        <w:t>ScriptBlock</w:t>
+      </w:r>
+      <w:proofErr w:type="spellEnd"/>
+      <w:r>
+        <w:rPr>
+          <w:rStyle w:val="CommandChar"/>
+          <w:sz w:val="22"/>
+          <w:szCs w:val="22"/>
+        </w:rPr>
+        <w:t xml:space="preserve"> {</w:t>
+      </w:r>
+      <w:proofErr w:type="spellStart"/>
+      <w:r>
+        <w:rPr>
+          <w:rStyle w:val="CommandChar"/>
+          <w:sz w:val="22"/>
+          <w:szCs w:val="22"/>
+        </w:rPr>
+        <w:t>dir</w:t>
+      </w:r>
+      <w:proofErr w:type="spellEnd"/>
+      <w:r>
+        <w:rPr>
+          <w:rStyle w:val="CommandChar"/>
+          <w:sz w:val="22"/>
+          <w:szCs w:val="22"/>
+        </w:rPr>
+        <w:t xml:space="preserve"> env:}</w:t>
+      </w:r>
+      <w:r>
+        <w:rPr>
+          <w:sz w:val="22"/>
+          <w:szCs w:val="22"/>
+        </w:rPr>
+        <w:br/>
+      </w:r>
+      <w:r>
+        <w:rPr>
+          <w:sz w:val="22"/>
+          <w:szCs w:val="22"/>
+        </w:rPr>
+        <w:br/>
+        <w:t xml:space="preserve">The cmdlet has a nice short alias, and computer name and script block can be positional parameters instead of named parameters: </w:t>
+      </w:r>
+      <w:r>
+        <w:rPr>
+          <w:sz w:val="22"/>
+          <w:szCs w:val="22"/>
+        </w:rPr>
+        <w:br/>
+      </w:r>
+      <w:proofErr w:type="spellStart"/>
+      <w:r>
+        <w:rPr>
+          <w:rStyle w:val="CommandChar"/>
+          <w:sz w:val="22"/>
+          <w:szCs w:val="22"/>
+        </w:rPr>
+        <w:t>icm</w:t>
+      </w:r>
+      <w:proofErr w:type="spellEnd"/>
+      <w:r>
+        <w:rPr>
+          <w:rStyle w:val="CommandChar"/>
+          <w:sz w:val="22"/>
+          <w:szCs w:val="22"/>
+        </w:rPr>
+        <w:t xml:space="preserve"> </w:t>
+      </w:r>
+      <w:proofErr w:type="spellStart"/>
+      <w:r>
+        <w:rPr>
+          <w:rStyle w:val="CommandChar"/>
+          <w:sz w:val="22"/>
+          <w:szCs w:val="22"/>
+        </w:rPr>
+        <w:t>duncan</w:t>
+      </w:r>
+      <w:proofErr w:type="spellEnd"/>
+      <w:r>
+        <w:rPr>
+          <w:rStyle w:val="CommandChar"/>
+          <w:sz w:val="22"/>
+          <w:szCs w:val="22"/>
+        </w:rPr>
+        <w:t xml:space="preserve"> {</w:t>
+      </w:r>
+      <w:proofErr w:type="spellStart"/>
+      <w:r>
+        <w:rPr>
+          <w:rStyle w:val="CommandChar"/>
+          <w:sz w:val="22"/>
+          <w:szCs w:val="22"/>
+        </w:rPr>
+        <w:t>dir</w:t>
+      </w:r>
+      <w:proofErr w:type="spellEnd"/>
+      <w:r>
+        <w:rPr>
+          <w:rStyle w:val="CommandChar"/>
+          <w:sz w:val="22"/>
+          <w:szCs w:val="22"/>
+        </w:rPr>
+        <w:t xml:space="preserve"> env:}</w:t>
+      </w:r>
+      <w:r>
+        <w:rPr>
+          <w:sz w:val="22"/>
+          <w:szCs w:val="22"/>
+        </w:rPr>
+        <w:t xml:space="preserve"> </w:t>
+      </w:r>
+      <w:r>
+        <w:rPr>
+          <w:sz w:val="22"/>
+          <w:szCs w:val="22"/>
+        </w:rPr>
+        <w:br/>
+        <w:t>(Does it make you happy to type fewer characters?)</w:t>
+      </w:r>
     </w:p>
     <w:p>
       <w:pPr>
@@ -4967,7 +5888,30 @@
           <w:sz w:val="22"/>
           <w:szCs w:val="22"/>
         </w:rPr>
-        <w:t xml:space="preserve">slaygore’s Number_of_processors? </w:t>
+        <w:t>DUNCAN</w:t>
+      </w:r>
+      <w:r>
+        <w:rPr>
+          <w:sz w:val="22"/>
+          <w:szCs w:val="22"/>
+        </w:rPr>
+        <w:t xml:space="preserve">’s </w:t>
+      </w:r>
+      <w:proofErr w:type="spellStart"/>
+      <w:r>
+        <w:rPr>
+          <w:sz w:val="22"/>
+          <w:szCs w:val="22"/>
+        </w:rPr>
+        <w:t>Number_of_processors</w:t>
+      </w:r>
+      <w:proofErr w:type="spellEnd"/>
+      <w:r>
+        <w:rPr>
+          <w:sz w:val="22"/>
+          <w:szCs w:val="22"/>
+        </w:rPr>
+        <w:t xml:space="preserve">? </w:t>
       </w:r>
       <w:sdt>
         <w:sdtPr>
@@ -5024,12 +5968,44 @@
         </w:rPr>
         <w:t xml:space="preserve">What is </w:t>
       </w:r>
-      <w:r>
-        <w:rPr>
-          <w:sz w:val="22"/>
-          <w:szCs w:val="22"/>
-        </w:rPr>
-        <w:t xml:space="preserve">the UserDomain on slaygore? </w:t>
+      <w:proofErr w:type="gramStart"/>
+      <w:r>
+        <w:rPr>
+          <w:sz w:val="22"/>
+          <w:szCs w:val="22"/>
+        </w:rPr>
+        <w:t xml:space="preserve">the </w:t>
+      </w:r>
+      <w:proofErr w:type="spellStart"/>
+      <w:r>
+        <w:rPr>
+          <w:sz w:val="22"/>
+          <w:szCs w:val="22"/>
+        </w:rPr>
+        <w:t>UserDomain</w:t>
+      </w:r>
+      <w:proofErr w:type="spellEnd"/>
+      <w:proofErr w:type="gramEnd"/>
+      <w:r>
+        <w:rPr>
+          <w:sz w:val="22"/>
+          <w:szCs w:val="22"/>
+        </w:rPr>
+        <w:t xml:space="preserve"> on </w:t>
+      </w:r>
+      <w:r>
+        <w:rPr>
+          <w:sz w:val="22"/>
+          <w:szCs w:val="22"/>
+        </w:rPr>
+        <w:t>DUNCAN</w:t>
+      </w:r>
+      <w:r>
+        <w:rPr>
+          <w:sz w:val="22"/>
+          <w:szCs w:val="22"/>
+        </w:rPr>
+        <w:t xml:space="preserve">? </w:t>
       </w:r>
       <w:sdt>
         <w:sdtPr>
@@ -5370,6 +6346,7 @@
           <w:sz w:val="22"/>
           <w:szCs w:val="22"/>
         </w:rPr>
+        <w:lastRenderedPageBreak/>
         <w:t xml:space="preserve">View the firewall rules for </w:t>
       </w:r>
       <w:r>
@@ -5437,18 +6414,369 @@
           <w:sz w:val="22"/>
           <w:szCs w:val="22"/>
         </w:rPr>
-        <w:lastRenderedPageBreak/>
-        <w:t xml:space="preserve">Look at the rule </w:t>
-      </w:r>
-      <w:r>
-        <w:rPr>
+        <w:t>That</w:t>
+      </w:r>
+      <w:r>
+        <w:rPr>
+          <w:sz w:val="22"/>
+          <w:szCs w:val="22"/>
+        </w:rPr>
+        <w:t xml:space="preserve"> command line </w:t>
+      </w:r>
+      <w:r>
+        <w:rPr>
+          <w:sz w:val="22"/>
+          <w:szCs w:val="22"/>
+        </w:rPr>
+        <w:t>delivered a lot of details. Filter it down to just the rule</w:t>
+      </w:r>
+      <w:r>
+        <w:rPr>
+          <w:sz w:val="22"/>
+          <w:szCs w:val="22"/>
+        </w:rPr>
+        <w:t>s’</w:t>
+      </w:r>
+      <w:r>
+        <w:rPr>
+          <w:sz w:val="22"/>
+          <w:szCs w:val="22"/>
+        </w:rPr>
+        <w:t xml:space="preserve"> names</w:t>
+      </w:r>
+      <w:r>
+        <w:rPr>
+          <w:sz w:val="22"/>
+          <w:szCs w:val="22"/>
+        </w:rPr>
+        <w:t>. Two ways to do that</w:t>
+      </w:r>
+      <w:r>
+        <w:rPr>
+          <w:sz w:val="22"/>
+          <w:szCs w:val="22"/>
+        </w:rPr>
+        <w:t>:</w:t>
+      </w:r>
+      <w:r>
+        <w:rPr>
+          <w:sz w:val="22"/>
+          <w:szCs w:val="22"/>
+        </w:rPr>
+        <w:br/>
+      </w:r>
+      <w:r>
+        <w:rPr>
+          <w:rFonts w:ascii="Consolas" w:hAnsi="Consolas"/>
           <w:b/>
           <w:bCs/>
           <w:sz w:val="22"/>
           <w:szCs w:val="22"/>
         </w:rPr>
-        <w:t>WINRM-HTTP-In-TCP-NoScope</w:t>
-      </w:r>
+        <w:t>G</w:t>
+      </w:r>
+      <w:r>
+        <w:rPr>
+          <w:rFonts w:ascii="Consolas" w:hAnsi="Consolas"/>
+          <w:b/>
+          <w:bCs/>
+          <w:sz w:val="22"/>
+          <w:szCs w:val="22"/>
+        </w:rPr>
+        <w:t>et-</w:t>
+      </w:r>
+      <w:r>
+        <w:rPr>
+          <w:rFonts w:ascii="Consolas" w:hAnsi="Consolas"/>
+          <w:b/>
+          <w:bCs/>
+          <w:sz w:val="22"/>
+          <w:szCs w:val="22"/>
+        </w:rPr>
+        <w:t>N</w:t>
+      </w:r>
+      <w:r>
+        <w:rPr>
+          <w:rFonts w:ascii="Consolas" w:hAnsi="Consolas"/>
+          <w:b/>
+          <w:bCs/>
+          <w:sz w:val="22"/>
+          <w:szCs w:val="22"/>
+        </w:rPr>
+        <w:t>et</w:t>
+      </w:r>
+      <w:r>
+        <w:rPr>
+          <w:rFonts w:ascii="Consolas" w:hAnsi="Consolas"/>
+          <w:b/>
+          <w:bCs/>
+          <w:sz w:val="22"/>
+          <w:szCs w:val="22"/>
+        </w:rPr>
+        <w:t>F</w:t>
+      </w:r>
+      <w:r>
+        <w:rPr>
+          <w:rFonts w:ascii="Consolas" w:hAnsi="Consolas"/>
+          <w:b/>
+          <w:bCs/>
+          <w:sz w:val="22"/>
+          <w:szCs w:val="22"/>
+        </w:rPr>
+        <w:t>irewall</w:t>
+      </w:r>
+      <w:r>
+        <w:rPr>
+          <w:rFonts w:ascii="Consolas" w:hAnsi="Consolas"/>
+          <w:b/>
+          <w:bCs/>
+          <w:sz w:val="22"/>
+          <w:szCs w:val="22"/>
+        </w:rPr>
+        <w:t>R</w:t>
+      </w:r>
+      <w:r>
+        <w:rPr>
+          <w:rFonts w:ascii="Consolas" w:hAnsi="Consolas"/>
+          <w:b/>
+          <w:bCs/>
+          <w:sz w:val="22"/>
+          <w:szCs w:val="22"/>
+        </w:rPr>
+        <w:t xml:space="preserve">ule </w:t>
+      </w:r>
+      <w:proofErr w:type="spellStart"/>
+      <w:r>
+        <w:rPr>
+          <w:rFonts w:ascii="Consolas" w:hAnsi="Consolas"/>
+          <w:b/>
+          <w:bCs/>
+          <w:sz w:val="22"/>
+          <w:szCs w:val="22"/>
+        </w:rPr>
+        <w:t>winrm</w:t>
+      </w:r>
+      <w:proofErr w:type="spellEnd"/>
+      <w:r>
+        <w:rPr>
+          <w:rFonts w:ascii="Consolas" w:hAnsi="Consolas"/>
+          <w:b/>
+          <w:bCs/>
+          <w:sz w:val="22"/>
+          <w:szCs w:val="22"/>
+        </w:rPr>
+        <w:t>*</w:t>
+      </w:r>
+      <w:r>
+        <w:rPr>
+          <w:rFonts w:ascii="Consolas" w:hAnsi="Consolas"/>
+          <w:b/>
+          <w:bCs/>
+          <w:sz w:val="22"/>
+          <w:szCs w:val="22"/>
+        </w:rPr>
+        <w:t xml:space="preserve"> | select name</w:t>
+      </w:r>
+      <w:r>
+        <w:rPr>
+          <w:sz w:val="22"/>
+          <w:szCs w:val="22"/>
+        </w:rPr>
+        <w:t xml:space="preserve"> </w:t>
+      </w:r>
+      <w:r>
+        <w:rPr>
+          <w:sz w:val="22"/>
+          <w:szCs w:val="22"/>
+        </w:rPr>
+        <w:br/>
+        <w:t>or</w:t>
+      </w:r>
+      <w:r>
+        <w:rPr>
+          <w:sz w:val="22"/>
+          <w:szCs w:val="22"/>
+        </w:rPr>
+        <w:br/>
+      </w:r>
+      <w:r>
+        <w:rPr>
+          <w:rFonts w:ascii="Consolas" w:hAnsi="Consolas"/>
+          <w:b/>
+          <w:bCs/>
+          <w:sz w:val="22"/>
+          <w:szCs w:val="22"/>
+        </w:rPr>
+        <w:t>(G</w:t>
+      </w:r>
+      <w:r>
+        <w:rPr>
+          <w:rFonts w:ascii="Consolas" w:hAnsi="Consolas"/>
+          <w:b/>
+          <w:bCs/>
+          <w:sz w:val="22"/>
+          <w:szCs w:val="22"/>
+        </w:rPr>
+        <w:t>et-</w:t>
+      </w:r>
+      <w:r>
+        <w:rPr>
+          <w:rFonts w:ascii="Consolas" w:hAnsi="Consolas"/>
+          <w:b/>
+          <w:bCs/>
+          <w:sz w:val="22"/>
+          <w:szCs w:val="22"/>
+        </w:rPr>
+        <w:t>N</w:t>
+      </w:r>
+      <w:r>
+        <w:rPr>
+          <w:rFonts w:ascii="Consolas" w:hAnsi="Consolas"/>
+          <w:b/>
+          <w:bCs/>
+          <w:sz w:val="22"/>
+          <w:szCs w:val="22"/>
+        </w:rPr>
+        <w:t>et</w:t>
+      </w:r>
+      <w:r>
+        <w:rPr>
+          <w:rFonts w:ascii="Consolas" w:hAnsi="Consolas"/>
+          <w:b/>
+          <w:bCs/>
+          <w:sz w:val="22"/>
+          <w:szCs w:val="22"/>
+        </w:rPr>
+        <w:t>F</w:t>
+      </w:r>
+      <w:r>
+        <w:rPr>
+          <w:rFonts w:ascii="Consolas" w:hAnsi="Consolas"/>
+          <w:b/>
+          <w:bCs/>
+          <w:sz w:val="22"/>
+          <w:szCs w:val="22"/>
+        </w:rPr>
+        <w:t>irewall</w:t>
+      </w:r>
+      <w:r>
+        <w:rPr>
+          <w:rFonts w:ascii="Consolas" w:hAnsi="Consolas"/>
+          <w:b/>
+          <w:bCs/>
+          <w:sz w:val="22"/>
+          <w:szCs w:val="22"/>
+        </w:rPr>
+        <w:t>R</w:t>
+      </w:r>
+      <w:r>
+        <w:rPr>
+          <w:rFonts w:ascii="Consolas" w:hAnsi="Consolas"/>
+          <w:b/>
+          <w:bCs/>
+          <w:sz w:val="22"/>
+          <w:szCs w:val="22"/>
+        </w:rPr>
+        <w:t xml:space="preserve">ule </w:t>
+      </w:r>
+      <w:proofErr w:type="spellStart"/>
+      <w:r>
+        <w:rPr>
+          <w:rFonts w:ascii="Consolas" w:hAnsi="Consolas"/>
+          <w:b/>
+          <w:bCs/>
+          <w:sz w:val="22"/>
+          <w:szCs w:val="22"/>
+        </w:rPr>
+        <w:t>winrm</w:t>
+      </w:r>
+      <w:proofErr w:type="spellEnd"/>
+      <w:r>
+        <w:rPr>
+          <w:rFonts w:ascii="Consolas" w:hAnsi="Consolas"/>
+          <w:b/>
+          <w:bCs/>
+          <w:sz w:val="22"/>
+          <w:szCs w:val="22"/>
+        </w:rPr>
+        <w:t>*</w:t>
+      </w:r>
+      <w:r>
+        <w:rPr>
+          <w:rFonts w:ascii="Consolas" w:hAnsi="Consolas"/>
+          <w:b/>
+          <w:bCs/>
+          <w:sz w:val="22"/>
+          <w:szCs w:val="22"/>
+        </w:rPr>
+        <w:t>).</w:t>
+      </w:r>
+      <w:r>
+        <w:rPr>
+          <w:rFonts w:ascii="Consolas" w:hAnsi="Consolas"/>
+          <w:b/>
+          <w:bCs/>
+          <w:sz w:val="22"/>
+          <w:szCs w:val="22"/>
+        </w:rPr>
+        <w:t>name</w:t>
+      </w:r>
+    </w:p>
+    <w:p>
+      <w:pPr>
+        <w:pStyle w:val="ListParagraph"/>
+        <w:numPr>
+          <w:ilvl w:val="0"/>
+          <w:numId w:val="20"/>
+        </w:numPr>
+        <w:spacing w:line="257" w:lineRule="auto"/>
+        <w:contextualSpacing w:val="0"/>
+        <w:rPr>
+          <w:sz w:val="22"/>
+          <w:szCs w:val="22"/>
+        </w:rPr>
+      </w:pPr>
+      <w:r>
+        <w:rPr>
+          <w:sz w:val="22"/>
+          <w:szCs w:val="22"/>
+        </w:rPr>
+        <w:t>Look at the rule</w:t>
+      </w:r>
+      <w:r>
+        <w:rPr>
+          <w:sz w:val="22"/>
+          <w:szCs w:val="22"/>
+        </w:rPr>
+        <w:t xml:space="preserve"> named</w:t>
+      </w:r>
+      <w:r>
+        <w:rPr>
+          <w:sz w:val="22"/>
+          <w:szCs w:val="22"/>
+        </w:rPr>
+        <w:t xml:space="preserve"> </w:t>
+      </w:r>
+      <w:r>
+        <w:rPr>
+          <w:b/>
+          <w:bCs/>
+          <w:sz w:val="22"/>
+          <w:szCs w:val="22"/>
+        </w:rPr>
+        <w:t>WINRM-HTTP-In-TCP-</w:t>
+      </w:r>
+      <w:proofErr w:type="spellStart"/>
+      <w:r>
+        <w:rPr>
+          <w:b/>
+          <w:bCs/>
+          <w:sz w:val="22"/>
+          <w:szCs w:val="22"/>
+        </w:rPr>
+        <w:t>NoScope</w:t>
+      </w:r>
+      <w:proofErr w:type="spellEnd"/>
       <w:r>
         <w:rPr>
           <w:sz w:val="22"/>
@@ -5670,7 +6998,31 @@
           <w:sz w:val="22"/>
           <w:szCs w:val="22"/>
         </w:rPr>
-        <w:t xml:space="preserve">Windows Powershell, then </w:t>
+        <w:t xml:space="preserve">each </w:t>
+      </w:r>
+      <w:r>
+        <w:rPr>
+          <w:color w:val="000000" w:themeColor="text1"/>
+          <w:sz w:val="22"/>
+          <w:szCs w:val="22"/>
+        </w:rPr>
+        <w:t>Powershell</w:t>
+      </w:r>
+      <w:r>
+        <w:rPr>
+          <w:color w:val="000000" w:themeColor="text1"/>
+          <w:sz w:val="22"/>
+          <w:szCs w:val="22"/>
+        </w:rPr>
+        <w:t xml:space="preserve"> you started</w:t>
+      </w:r>
+      <w:r>
+        <w:rPr>
+          <w:color w:val="000000" w:themeColor="text1"/>
+          <w:sz w:val="22"/>
+          <w:szCs w:val="22"/>
+        </w:rPr>
+        <w:t xml:space="preserve">, then </w:t>
       </w:r>
       <w:r>
         <w:rPr>
@@ -5699,25 +7051,31 @@
           <w:sz w:val="22"/>
           <w:szCs w:val="22"/>
         </w:rPr>
-        <w:t>a</w:t>
-      </w:r>
-      <w:r>
-        <w:rPr>
-          <w:i/>
-          <w:iCs/>
-          <w:color w:val="000000" w:themeColor="text1"/>
-          <w:sz w:val="22"/>
-          <w:szCs w:val="22"/>
-        </w:rPr>
-        <w:t xml:space="preserve"> third time</w:t>
-      </w:r>
-      <w:r>
-        <w:rPr>
-          <w:color w:val="000000" w:themeColor="text1"/>
-          <w:sz w:val="22"/>
-          <w:szCs w:val="22"/>
-        </w:rPr>
-        <w:t xml:space="preserve"> to close </w:t>
+        <w:t>yet again</w:t>
+      </w:r>
+      <w:r>
+        <w:rPr>
+          <w:color w:val="000000" w:themeColor="text1"/>
+          <w:sz w:val="22"/>
+          <w:szCs w:val="22"/>
+        </w:rPr>
+        <w:t xml:space="preserve"> </w:t>
+      </w:r>
+      <w:r>
+        <w:rPr>
+          <w:color w:val="000000" w:themeColor="text1"/>
+          <w:sz w:val="22"/>
+          <w:szCs w:val="22"/>
+        </w:rPr>
+        <w:t xml:space="preserve">at your CMD prompt </w:t>
+      </w:r>
+      <w:r>
+        <w:rPr>
+          <w:color w:val="000000" w:themeColor="text1"/>
+          <w:sz w:val="22"/>
+          <w:szCs w:val="22"/>
+        </w:rPr>
+        <w:t xml:space="preserve">to close </w:t>
       </w:r>
       <w:r>
         <w:rPr>
@@ -5810,7 +7168,7 @@
       </w:r>
     </w:p>
     <w:sectPr>
-      <w:footerReference w:type="default" r:id="rId10"/>
+      <w:footerReference w:type="default" r:id="rId9"/>
       <w:pgSz w:w="12240" w:h="15840"/>
       <w:pgMar w:top="720" w:right="720" w:bottom="1152" w:left="720" w:header="0" w:footer="288" w:gutter="0"/>
       <w:cols w:space="720"/>
@@ -10088,6 +11446,37 @@
         </w:p>
       </w:docPartBody>
     </w:docPart>
+    <w:docPart>
+      <w:docPartPr>
+        <w:name w:val="44DAE46C7447473297CDCAC75C82D19C"/>
+        <w:category>
+          <w:name w:val="General"/>
+          <w:gallery w:val="placeholder"/>
+        </w:category>
+        <w:types>
+          <w:type w:val="bbPlcHdr"/>
+        </w:types>
+        <w:behaviors>
+          <w:behavior w:val="content"/>
+        </w:behaviors>
+        <w:guid w:val="{223BF607-5702-40D8-89BB-87C1969C810C}"/>
+      </w:docPartPr>
+      <w:docPartBody>
+        <w:p>
+          <w:pPr>
+            <w:pStyle w:val="44DAE46C7447473297CDCAC75C82D19C"/>
+          </w:pPr>
+          <w:r>
+            <w:rPr>
+              <w:rStyle w:val="PlaceholderText"/>
+              <w:sz w:val="22"/>
+              <w:szCs w:val="22"/>
+            </w:rPr>
+            <w:t>Click or tap here to enter text.</w:t>
+          </w:r>
+        </w:p>
+      </w:docPartBody>
+    </w:docPart>
   </w:docParts>
 </w:glossaryDocument>
 </file>
@@ -10172,6 +11561,7 @@
     <w:rsid w:val="000D5805"/>
     <w:rsid w:val="000E2A5E"/>
     <w:rsid w:val="0010612B"/>
+    <w:rsid w:val="001271C9"/>
     <w:rsid w:val="00150ED0"/>
     <w:rsid w:val="00150FB8"/>
     <w:rsid w:val="00155098"/>
@@ -10179,6 +11569,7 @@
     <w:rsid w:val="002304E2"/>
     <w:rsid w:val="00230F4B"/>
     <w:rsid w:val="002464E0"/>
+    <w:rsid w:val="0025245C"/>
     <w:rsid w:val="002A5C42"/>
     <w:rsid w:val="002D68FF"/>
     <w:rsid w:val="00327672"/>
@@ -10190,6 +11581,7 @@
     <w:rsid w:val="004462A2"/>
     <w:rsid w:val="00485224"/>
     <w:rsid w:val="004E7D5B"/>
+    <w:rsid w:val="006271AA"/>
     <w:rsid w:val="006452CE"/>
     <w:rsid w:val="00646A7A"/>
     <w:rsid w:val="00655FB1"/>
@@ -10684,7 +12076,7 @@
     <w:basedOn w:val="DefaultParagraphFont"/>
     <w:uiPriority w:val="99"/>
     <w:semiHidden/>
-    <w:rsid w:val="00646A7A"/>
+    <w:rsid w:val="006271AA"/>
     <w:rPr>
       <w:color w:val="808080"/>
     </w:rPr>
@@ -10896,6 +12288,19 @@
   <w:style w:type="paragraph" w:customStyle="1" w:styleId="3B6CEC9817B3430AA23275CDB91A92D6">
     <w:name w:val="3B6CEC9817B3430AA23275CDB91A92D6"/>
     <w:rsid w:val="00646A7A"/>
+    <w:pPr>
+      <w:spacing w:line="278" w:lineRule="auto"/>
+    </w:pPr>
+    <w:rPr>
+      <w:kern w:val="2"/>
+      <w:sz w:val="24"/>
+      <w:szCs w:val="24"/>
+      <w14:ligatures w14:val="standardContextual"/>
+    </w:rPr>
+  </w:style>
+  <w:style w:type="paragraph" w:customStyle="1" w:styleId="44DAE46C7447473297CDCAC75C82D19C">
+    <w:name w:val="44DAE46C7447473297CDCAC75C82D19C"/>
+    <w:rsid w:val="006271AA"/>
     <w:pPr>
       <w:spacing w:line="278" w:lineRule="auto"/>
     </w:pPr>

</xml_diff>

<commit_message>
corrected expected CLI prompts and endpoint security
</commit_message>
<xml_diff>
--- a/CYBER360-Ex-3.3-Intro-Remoting.docx
+++ b/CYBER360-Ex-3.3-Intro-Remoting.docx
@@ -850,14 +850,44 @@
           <w:sz w:val="22"/>
           <w:szCs w:val="22"/>
         </w:rPr>
-        <w:t xml:space="preserve">If you successfully type the correct password when prompted, you will see </w:t>
-      </w:r>
-      <w:r>
-        <w:rPr>
-          <w:sz w:val="22"/>
-          <w:szCs w:val="22"/>
-        </w:rPr>
-        <w:t>a prompt like this:</w:t>
+        <w:t>If you successfully type the correct password when prompted, you</w:t>
+      </w:r>
+      <w:r>
+        <w:rPr>
+          <w:sz w:val="22"/>
+          <w:szCs w:val="22"/>
+        </w:rPr>
+        <w:t xml:space="preserve"> should</w:t>
+      </w:r>
+      <w:r>
+        <w:rPr>
+          <w:sz w:val="22"/>
+          <w:szCs w:val="22"/>
+        </w:rPr>
+        <w:t xml:space="preserve"> see </w:t>
+      </w:r>
+      <w:r>
+        <w:rPr>
+          <w:sz w:val="22"/>
+          <w:szCs w:val="22"/>
+        </w:rPr>
+        <w:t xml:space="preserve">a prompt </w:t>
+      </w:r>
+      <w:proofErr w:type="gramStart"/>
+      <w:r>
+        <w:rPr>
+          <w:sz w:val="22"/>
+          <w:szCs w:val="22"/>
+        </w:rPr>
+        <w:t>similar to</w:t>
+      </w:r>
+      <w:proofErr w:type="gramEnd"/>
+      <w:r>
+        <w:rPr>
+          <w:sz w:val="22"/>
+          <w:szCs w:val="22"/>
+        </w:rPr>
+        <w:t xml:space="preserve"> this:</w:t>
       </w:r>
       <w:r>
         <w:rPr>
@@ -872,7 +902,15 @@
           <w:sz w:val="22"/>
           <w:szCs w:val="22"/>
         </w:rPr>
-        <w:t>PS C:\Users\mer23079&gt;</w:t>
+        <w:t>cyber360\mer23079@HORACE</w:t>
+      </w:r>
+      <w:r>
+        <w:rPr>
+          <w:rFonts w:ascii="Lucida Console" w:hAnsi="Lucida Console"/>
+          <w:sz w:val="22"/>
+          <w:szCs w:val="22"/>
+        </w:rPr>
+        <w:t xml:space="preserve"> C:\Users\mer23079&gt;</w:t>
       </w:r>
       <w:r>
         <w:rPr>
@@ -1180,19 +1218,8 @@
           <w:sz w:val="22"/>
           <w:szCs w:val="22"/>
         </w:rPr>
-        <w:t>-</w:t>
-      </w:r>
-      <w:proofErr w:type="spellStart"/>
-      <w:r>
-        <w:rPr>
-          <w:b/>
-          <w:bCs/>
-          <w:sz w:val="22"/>
-          <w:szCs w:val="22"/>
-        </w:rPr>
-        <w:t>ComputerName</w:t>
-      </w:r>
-      <w:proofErr w:type="spellEnd"/>
+        <w:t>-ComputerName</w:t>
+      </w:r>
       <w:r>
         <w:rPr>
           <w:sz w:val="22"/>
@@ -1486,7 +1513,6 @@
         </w:rPr>
         <w:t xml:space="preserve">  </w:t>
       </w:r>
-      <w:proofErr w:type="spellStart"/>
       <w:r>
         <w:rPr>
           <w:rFonts w:ascii="Consolas" w:hAnsi="Consolas"/>
@@ -1497,7 +1523,6 @@
         </w:rPr>
         <w:t>pwsh</w:t>
       </w:r>
-      <w:proofErr w:type="spellEnd"/>
       <w:proofErr w:type="gramEnd"/>
       <w:r>
         <w:rPr>
@@ -4060,7 +4085,6 @@
         </w:rPr>
         <w:br/>
       </w:r>
-      <w:proofErr w:type="spellStart"/>
       <w:r>
         <w:rPr>
           <w:rStyle w:val="AnswerChar"/>
@@ -4071,9 +4095,8 @@
           <w:sz w:val="22"/>
           <w:szCs w:val="22"/>
         </w:rPr>
-        <w:t>gps</w:t>
-      </w:r>
-      <w:proofErr w:type="spellEnd"/>
+        <w:t>gps -co</w:t>
+      </w:r>
       <w:r>
         <w:rPr>
           <w:rStyle w:val="AnswerChar"/>
@@ -4084,9 +4107,8 @@
           <w:sz w:val="22"/>
           <w:szCs w:val="22"/>
         </w:rPr>
-        <w:t xml:space="preserve"> -</w:t>
-      </w:r>
-      <w:proofErr w:type="spellStart"/>
+        <w:t>m</w:t>
+      </w:r>
       <w:r>
         <w:rPr>
           <w:rStyle w:val="AnswerChar"/>
@@ -4097,7 +4119,7 @@
           <w:sz w:val="22"/>
           <w:szCs w:val="22"/>
         </w:rPr>
-        <w:t>co</w:t>
+        <w:t xml:space="preserve">putername </w:t>
       </w:r>
       <w:r>
         <w:rPr>
@@ -4109,47 +4131,8 @@
           <w:sz w:val="22"/>
           <w:szCs w:val="22"/>
         </w:rPr>
-        <w:t>m</w:t>
-      </w:r>
-      <w:r>
-        <w:rPr>
-          <w:rStyle w:val="AnswerChar"/>
-          <w:rFonts w:ascii="Consolas" w:hAnsi="Consolas"/>
-          <w:b/>
-          <w:bCs/>
-          <w:color w:val="auto"/>
-          <w:sz w:val="22"/>
-          <w:szCs w:val="22"/>
-        </w:rPr>
-        <w:t>putername</w:t>
-      </w:r>
-      <w:proofErr w:type="spellEnd"/>
-      <w:r>
-        <w:rPr>
-          <w:rStyle w:val="AnswerChar"/>
-          <w:rFonts w:ascii="Consolas" w:hAnsi="Consolas"/>
-          <w:b/>
-          <w:bCs/>
-          <w:color w:val="auto"/>
-          <w:sz w:val="22"/>
-          <w:szCs w:val="22"/>
-        </w:rPr>
-        <w:t xml:space="preserve"> </w:t>
-      </w:r>
-      <w:proofErr w:type="spellStart"/>
-      <w:r>
-        <w:rPr>
-          <w:rStyle w:val="AnswerChar"/>
-          <w:rFonts w:ascii="Consolas" w:hAnsi="Consolas"/>
-          <w:b/>
-          <w:bCs/>
-          <w:color w:val="auto"/>
-          <w:sz w:val="22"/>
-          <w:szCs w:val="22"/>
-        </w:rPr>
         <w:t>duncan</w:t>
       </w:r>
-      <w:proofErr w:type="spellEnd"/>
     </w:p>
     <w:p>
       <w:pPr>
@@ -4801,7 +4784,6 @@
         </w:rPr>
         <w:t xml:space="preserve">either  </w:t>
       </w:r>
-      <w:proofErr w:type="spellStart"/>
       <w:r>
         <w:rPr>
           <w:rFonts w:ascii="Consolas" w:hAnsi="Consolas"/>
@@ -4812,7 +4794,6 @@
         </w:rPr>
         <w:t>pwsh</w:t>
       </w:r>
-      <w:proofErr w:type="spellEnd"/>
       <w:proofErr w:type="gramEnd"/>
       <w:r>
         <w:rPr>
@@ -4829,7 +4810,6 @@
         </w:rPr>
         <w:t xml:space="preserve">or  </w:t>
       </w:r>
-      <w:proofErr w:type="spellStart"/>
       <w:r>
         <w:rPr>
           <w:rFonts w:ascii="Consolas" w:hAnsi="Consolas"/>
@@ -4840,7 +4820,6 @@
         </w:rPr>
         <w:t>powershell</w:t>
       </w:r>
-      <w:proofErr w:type="spellEnd"/>
       <w:proofErr w:type="gramEnd"/>
       <w:r>
         <w:rPr>
@@ -5474,23 +5453,7 @@
           <w:sz w:val="22"/>
           <w:szCs w:val="22"/>
         </w:rPr>
-        <w:t xml:space="preserve"> </w:t>
-      </w:r>
-      <w:proofErr w:type="spellStart"/>
-      <w:r>
-        <w:rPr>
-          <w:sz w:val="22"/>
-          <w:szCs w:val="22"/>
-        </w:rPr>
-        <w:t>Processor_Architecture</w:t>
-      </w:r>
-      <w:proofErr w:type="spellEnd"/>
-      <w:r>
-        <w:rPr>
-          <w:sz w:val="22"/>
-          <w:szCs w:val="22"/>
-        </w:rPr>
-        <w:t>?</w:t>
+        <w:t xml:space="preserve"> Processor_Architecture?</w:t>
       </w:r>
       <w:r>
         <w:rPr>
@@ -5696,79 +5659,23 @@
           <w:sz w:val="22"/>
           <w:szCs w:val="22"/>
         </w:rPr>
-        <w:t>Invoke-Command -</w:t>
-      </w:r>
-      <w:proofErr w:type="spellStart"/>
+        <w:t xml:space="preserve">Invoke-Command -ComputerName </w:t>
+      </w:r>
       <w:r>
         <w:rPr>
           <w:rStyle w:val="CommandChar"/>
           <w:sz w:val="22"/>
           <w:szCs w:val="22"/>
         </w:rPr>
-        <w:t>ComputerName</w:t>
-      </w:r>
-      <w:proofErr w:type="spellEnd"/>
+        <w:t>duncan</w:t>
+      </w:r>
       <w:r>
         <w:rPr>
           <w:rStyle w:val="CommandChar"/>
           <w:sz w:val="22"/>
           <w:szCs w:val="22"/>
         </w:rPr>
-        <w:t xml:space="preserve"> </w:t>
-      </w:r>
-      <w:proofErr w:type="spellStart"/>
-      <w:r>
-        <w:rPr>
-          <w:rStyle w:val="CommandChar"/>
-          <w:sz w:val="22"/>
-          <w:szCs w:val="22"/>
-        </w:rPr>
-        <w:t>duncan</w:t>
-      </w:r>
-      <w:proofErr w:type="spellEnd"/>
-      <w:r>
-        <w:rPr>
-          <w:rStyle w:val="CommandChar"/>
-          <w:sz w:val="22"/>
-          <w:szCs w:val="22"/>
-        </w:rPr>
-        <w:t xml:space="preserve"> -</w:t>
-      </w:r>
-      <w:proofErr w:type="spellStart"/>
-      <w:r>
-        <w:rPr>
-          <w:rStyle w:val="CommandChar"/>
-          <w:sz w:val="22"/>
-          <w:szCs w:val="22"/>
-        </w:rPr>
-        <w:t>ScriptBlock</w:t>
-      </w:r>
-      <w:proofErr w:type="spellEnd"/>
-      <w:r>
-        <w:rPr>
-          <w:rStyle w:val="CommandChar"/>
-          <w:sz w:val="22"/>
-          <w:szCs w:val="22"/>
-        </w:rPr>
-        <w:t xml:space="preserve"> {</w:t>
-      </w:r>
-      <w:proofErr w:type="spellStart"/>
-      <w:r>
-        <w:rPr>
-          <w:rStyle w:val="CommandChar"/>
-          <w:sz w:val="22"/>
-          <w:szCs w:val="22"/>
-        </w:rPr>
-        <w:t>dir</w:t>
-      </w:r>
-      <w:proofErr w:type="spellEnd"/>
-      <w:r>
-        <w:rPr>
-          <w:rStyle w:val="CommandChar"/>
-          <w:sz w:val="22"/>
-          <w:szCs w:val="22"/>
-        </w:rPr>
-        <w:t xml:space="preserve"> env:}</w:t>
+        <w:t xml:space="preserve"> -ScriptBlock {dir env:}</w:t>
       </w:r>
       <w:r>
         <w:rPr>
@@ -5792,7 +5699,6 @@
         </w:rPr>
         <w:br/>
       </w:r>
-      <w:proofErr w:type="spellStart"/>
       <w:r>
         <w:rPr>
           <w:rStyle w:val="CommandChar"/>
@@ -5801,7 +5707,6 @@
         </w:rPr>
         <w:t>icm</w:t>
       </w:r>
-      <w:proofErr w:type="spellEnd"/>
       <w:r>
         <w:rPr>
           <w:rStyle w:val="CommandChar"/>
@@ -5810,7 +5715,6 @@
         </w:rPr>
         <w:t xml:space="preserve"> </w:t>
       </w:r>
-      <w:proofErr w:type="spellStart"/>
       <w:r>
         <w:rPr>
           <w:rStyle w:val="CommandChar"/>
@@ -5819,32 +5723,13 @@
         </w:rPr>
         <w:t>duncan</w:t>
       </w:r>
-      <w:proofErr w:type="spellEnd"/>
       <w:r>
         <w:rPr>
           <w:rStyle w:val="CommandChar"/>
           <w:sz w:val="22"/>
           <w:szCs w:val="22"/>
         </w:rPr>
-        <w:t xml:space="preserve"> {</w:t>
-      </w:r>
-      <w:proofErr w:type="spellStart"/>
-      <w:r>
-        <w:rPr>
-          <w:rStyle w:val="CommandChar"/>
-          <w:sz w:val="22"/>
-          <w:szCs w:val="22"/>
-        </w:rPr>
-        <w:t>dir</w:t>
-      </w:r>
-      <w:proofErr w:type="spellEnd"/>
-      <w:r>
-        <w:rPr>
-          <w:rStyle w:val="CommandChar"/>
-          <w:sz w:val="22"/>
-          <w:szCs w:val="22"/>
-        </w:rPr>
-        <w:t xml:space="preserve"> env:}</w:t>
+        <w:t xml:space="preserve"> {dir env:}</w:t>
       </w:r>
       <w:r>
         <w:rPr>
@@ -5895,23 +5780,7 @@
           <w:sz w:val="22"/>
           <w:szCs w:val="22"/>
         </w:rPr>
-        <w:t xml:space="preserve">’s </w:t>
-      </w:r>
-      <w:proofErr w:type="spellStart"/>
-      <w:r>
-        <w:rPr>
-          <w:sz w:val="22"/>
-          <w:szCs w:val="22"/>
-        </w:rPr>
-        <w:t>Number_of_processors</w:t>
-      </w:r>
-      <w:proofErr w:type="spellEnd"/>
-      <w:r>
-        <w:rPr>
-          <w:sz w:val="22"/>
-          <w:szCs w:val="22"/>
-        </w:rPr>
-        <w:t xml:space="preserve">? </w:t>
+        <w:t xml:space="preserve">’s Number_of_processors? </w:t>
       </w:r>
       <w:sdt>
         <w:sdtPr>
@@ -5974,17 +5843,8 @@
           <w:sz w:val="22"/>
           <w:szCs w:val="22"/>
         </w:rPr>
-        <w:t xml:space="preserve">the </w:t>
-      </w:r>
-      <w:proofErr w:type="spellStart"/>
-      <w:r>
-        <w:rPr>
-          <w:sz w:val="22"/>
-          <w:szCs w:val="22"/>
-        </w:rPr>
-        <w:t>UserDomain</w:t>
-      </w:r>
-      <w:proofErr w:type="spellEnd"/>
+        <w:t>the UserDomain</w:t>
+      </w:r>
       <w:proofErr w:type="gramEnd"/>
       <w:r>
         <w:rPr>
@@ -6543,9 +6403,8 @@
           <w:sz w:val="22"/>
           <w:szCs w:val="22"/>
         </w:rPr>
-        <w:t xml:space="preserve">ule </w:t>
-      </w:r>
-      <w:proofErr w:type="spellStart"/>
+        <w:t>ule winrm*</w:t>
+      </w:r>
       <w:r>
         <w:rPr>
           <w:rFonts w:ascii="Consolas" w:hAnsi="Consolas"/>
@@ -6554,9 +6413,30 @@
           <w:sz w:val="22"/>
           <w:szCs w:val="22"/>
         </w:rPr>
-        <w:t>winrm</w:t>
-      </w:r>
-      <w:proofErr w:type="spellEnd"/>
+        <w:t xml:space="preserve"> | select name</w:t>
+      </w:r>
+      <w:r>
+        <w:rPr>
+          <w:sz w:val="22"/>
+          <w:szCs w:val="22"/>
+        </w:rPr>
+        <w:t xml:space="preserve"> </w:t>
+      </w:r>
+      <w:r>
+        <w:rPr>
+          <w:sz w:val="22"/>
+          <w:szCs w:val="22"/>
+        </w:rPr>
+        <w:br/>
+        <w:t>or</w:t>
+      </w:r>
+      <w:r>
+        <w:rPr>
+          <w:sz w:val="22"/>
+          <w:szCs w:val="22"/>
+        </w:rPr>
+        <w:br/>
+      </w:r>
       <w:r>
         <w:rPr>
           <w:rFonts w:ascii="Consolas" w:hAnsi="Consolas"/>
@@ -6565,7 +6445,7 @@
           <w:sz w:val="22"/>
           <w:szCs w:val="22"/>
         </w:rPr>
-        <w:t>*</w:t>
+        <w:t>(G</w:t>
       </w:r>
       <w:r>
         <w:rPr>
@@ -6575,29 +6455,7 @@
           <w:sz w:val="22"/>
           <w:szCs w:val="22"/>
         </w:rPr>
-        <w:t xml:space="preserve"> | select name</w:t>
-      </w:r>
-      <w:r>
-        <w:rPr>
-          <w:sz w:val="22"/>
-          <w:szCs w:val="22"/>
-        </w:rPr>
-        <w:t xml:space="preserve"> </w:t>
-      </w:r>
-      <w:r>
-        <w:rPr>
-          <w:sz w:val="22"/>
-          <w:szCs w:val="22"/>
-        </w:rPr>
-        <w:br/>
-        <w:t>or</w:t>
-      </w:r>
-      <w:r>
-        <w:rPr>
-          <w:sz w:val="22"/>
-          <w:szCs w:val="22"/>
-        </w:rPr>
-        <w:br/>
+        <w:t>et-</w:t>
       </w:r>
       <w:r>
         <w:rPr>
@@ -6607,7 +6465,7 @@
           <w:sz w:val="22"/>
           <w:szCs w:val="22"/>
         </w:rPr>
-        <w:t>(G</w:t>
+        <w:t>N</w:t>
       </w:r>
       <w:r>
         <w:rPr>
@@ -6617,7 +6475,7 @@
           <w:sz w:val="22"/>
           <w:szCs w:val="22"/>
         </w:rPr>
-        <w:t>et-</w:t>
+        <w:t>et</w:t>
       </w:r>
       <w:r>
         <w:rPr>
@@ -6627,7 +6485,7 @@
           <w:sz w:val="22"/>
           <w:szCs w:val="22"/>
         </w:rPr>
-        <w:t>N</w:t>
+        <w:t>F</w:t>
       </w:r>
       <w:r>
         <w:rPr>
@@ -6637,7 +6495,7 @@
           <w:sz w:val="22"/>
           <w:szCs w:val="22"/>
         </w:rPr>
-        <w:t>et</w:t>
+        <w:t>irewall</w:t>
       </w:r>
       <w:r>
         <w:rPr>
@@ -6647,7 +6505,7 @@
           <w:sz w:val="22"/>
           <w:szCs w:val="22"/>
         </w:rPr>
-        <w:t>F</w:t>
+        <w:t>R</w:t>
       </w:r>
       <w:r>
         <w:rPr>
@@ -6657,7 +6515,7 @@
           <w:sz w:val="22"/>
           <w:szCs w:val="22"/>
         </w:rPr>
-        <w:t>irewall</w:t>
+        <w:t>ule winrm*</w:t>
       </w:r>
       <w:r>
         <w:rPr>
@@ -6667,59 +6525,7 @@
           <w:sz w:val="22"/>
           <w:szCs w:val="22"/>
         </w:rPr>
-        <w:t>R</w:t>
-      </w:r>
-      <w:r>
-        <w:rPr>
-          <w:rFonts w:ascii="Consolas" w:hAnsi="Consolas"/>
-          <w:b/>
-          <w:bCs/>
-          <w:sz w:val="22"/>
-          <w:szCs w:val="22"/>
-        </w:rPr>
-        <w:t xml:space="preserve">ule </w:t>
-      </w:r>
-      <w:proofErr w:type="spellStart"/>
-      <w:r>
-        <w:rPr>
-          <w:rFonts w:ascii="Consolas" w:hAnsi="Consolas"/>
-          <w:b/>
-          <w:bCs/>
-          <w:sz w:val="22"/>
-          <w:szCs w:val="22"/>
-        </w:rPr>
-        <w:t>winrm</w:t>
-      </w:r>
-      <w:proofErr w:type="spellEnd"/>
-      <w:r>
-        <w:rPr>
-          <w:rFonts w:ascii="Consolas" w:hAnsi="Consolas"/>
-          <w:b/>
-          <w:bCs/>
-          <w:sz w:val="22"/>
-          <w:szCs w:val="22"/>
-        </w:rPr>
-        <w:t>*</w:t>
-      </w:r>
-      <w:r>
-        <w:rPr>
-          <w:rFonts w:ascii="Consolas" w:hAnsi="Consolas"/>
-          <w:b/>
-          <w:bCs/>
-          <w:sz w:val="22"/>
-          <w:szCs w:val="22"/>
-        </w:rPr>
-        <w:t>).</w:t>
-      </w:r>
-      <w:r>
-        <w:rPr>
-          <w:rFonts w:ascii="Consolas" w:hAnsi="Consolas"/>
-          <w:b/>
-          <w:bCs/>
-          <w:sz w:val="22"/>
-          <w:szCs w:val="22"/>
-        </w:rPr>
-        <w:t>name</w:t>
+        <w:t>).name</w:t>
       </w:r>
     </w:p>
     <w:p>
@@ -6764,19 +6570,8 @@
           <w:sz w:val="22"/>
           <w:szCs w:val="22"/>
         </w:rPr>
-        <w:t>WINRM-HTTP-In-TCP-</w:t>
-      </w:r>
-      <w:proofErr w:type="spellStart"/>
-      <w:r>
-        <w:rPr>
-          <w:b/>
-          <w:bCs/>
-          <w:sz w:val="22"/>
-          <w:szCs w:val="22"/>
-        </w:rPr>
-        <w:t>NoScope</w:t>
-      </w:r>
-      <w:proofErr w:type="spellEnd"/>
+        <w:t>WINRM-HTTP-In-TCP-NoScope</w:t>
+      </w:r>
       <w:r>
         <w:rPr>
           <w:sz w:val="22"/>
@@ -11557,6 +11352,7 @@
   <w:rsids>
     <w:rsidRoot w:val="003E4C64"/>
     <w:rsid w:val="0000067C"/>
+    <w:rsid w:val="00032448"/>
     <w:rsid w:val="00062470"/>
     <w:rsid w:val="000D5805"/>
     <w:rsid w:val="000E2A5E"/>
@@ -11580,6 +11376,7 @@
     <w:rsid w:val="004365BA"/>
     <w:rsid w:val="004462A2"/>
     <w:rsid w:val="00485224"/>
+    <w:rsid w:val="004A2BF8"/>
     <w:rsid w:val="004E7D5B"/>
     <w:rsid w:val="006271AA"/>
     <w:rsid w:val="006452CE"/>
@@ -11606,6 +11403,7 @@
     <w:rsid w:val="00B72C94"/>
     <w:rsid w:val="00BF1762"/>
     <w:rsid w:val="00BF31B0"/>
+    <w:rsid w:val="00C21B74"/>
     <w:rsid w:val="00C40C05"/>
     <w:rsid w:val="00C428B3"/>
     <w:rsid w:val="00C84655"/>

</xml_diff>